<commit_message>
mysql self study guide .
</commit_message>
<xml_diff>
--- a/MYSQLDB/self_study_guide/Client-server-architecture.docx
+++ b/MYSQLDB/self_study_guide/Client-server-architecture.docx
@@ -15,61 +15,21 @@
           <w:color w:val="27251E"/>
           <w:sz w:val="24"/>
           <w:szCs w:val="24"/>
-          <w:lang/>
-        </w:rPr>
-      </w:pPr>
-      <w:r>
-        <w:rPr>
-          <w:rFonts w:asciiTheme="majorBidi" w:eastAsia="Times New Roman" w:hAnsiTheme="majorBidi" w:cstheme="majorBidi"/>
-          <w:b/>
-          <w:bCs/>
-          <w:color w:val="27251E"/>
-          <w:sz w:val="24"/>
-          <w:szCs w:val="24"/>
-          <w:lang/>
-        </w:rPr>
-        <w:t xml:space="preserve">Client/Server Architecture </w:t>
-      </w:r>
-      <w:proofErr w:type="gramStart"/>
-      <w:r>
-        <w:rPr>
-          <w:rFonts w:asciiTheme="majorBidi" w:eastAsia="Times New Roman" w:hAnsiTheme="majorBidi" w:cstheme="majorBidi"/>
-          <w:b/>
-          <w:bCs/>
-          <w:color w:val="27251E"/>
-          <w:sz w:val="24"/>
-          <w:szCs w:val="24"/>
-          <w:lang/>
-        </w:rPr>
-        <w:t>With</w:t>
-      </w:r>
-      <w:proofErr w:type="gramEnd"/>
-      <w:r>
-        <w:rPr>
-          <w:rFonts w:asciiTheme="majorBidi" w:eastAsia="Times New Roman" w:hAnsiTheme="majorBidi" w:cstheme="majorBidi"/>
-          <w:b/>
-          <w:bCs/>
-          <w:color w:val="27251E"/>
-          <w:sz w:val="24"/>
-          <w:szCs w:val="24"/>
-          <w:lang/>
-        </w:rPr>
-        <w:t xml:space="preserve"> </w:t>
-      </w:r>
-      <w:proofErr w:type="spellStart"/>
-      <w:r>
-        <w:rPr>
-          <w:rFonts w:asciiTheme="majorBidi" w:eastAsia="Times New Roman" w:hAnsiTheme="majorBidi" w:cstheme="majorBidi"/>
-          <w:b/>
-          <w:bCs/>
-          <w:color w:val="27251E"/>
-          <w:sz w:val="24"/>
-          <w:szCs w:val="24"/>
-          <w:lang/>
-        </w:rPr>
-        <w:t>MySQL</w:t>
-      </w:r>
-      <w:proofErr w:type="spellEnd"/>
+          <w:lang w:val="en-US"/>
+        </w:rPr>
+      </w:pPr>
+      <w:r>
+        <w:rPr>
+          <w:rFonts w:asciiTheme="majorBidi" w:eastAsia="Times New Roman" w:hAnsiTheme="majorBidi" w:cstheme="majorBidi"/>
+          <w:b/>
+          <w:bCs/>
+          <w:color w:val="27251E"/>
+          <w:sz w:val="24"/>
+          <w:szCs w:val="24"/>
+          <w:lang w:val="en-US"/>
+        </w:rPr>
+        <w:t>Client/Server Architecture With MySQL</w:t>
+      </w:r>
     </w:p>
     <w:p>
       <w:pPr>
@@ -83,18 +43,18 @@
           <w:color w:val="27251E"/>
           <w:sz w:val="24"/>
           <w:szCs w:val="24"/>
-          <w:lang/>
-        </w:rPr>
-      </w:pPr>
-      <w:r>
-        <w:rPr>
-          <w:rFonts w:asciiTheme="majorBidi" w:eastAsia="Times New Roman" w:hAnsiTheme="majorBidi" w:cstheme="majorBidi"/>
-          <w:b/>
-          <w:bCs/>
-          <w:color w:val="27251E"/>
-          <w:sz w:val="24"/>
-          <w:szCs w:val="24"/>
-          <w:lang/>
+          <w:lang w:val="en-US"/>
+        </w:rPr>
+      </w:pPr>
+      <w:r>
+        <w:rPr>
+          <w:rFonts w:asciiTheme="majorBidi" w:eastAsia="Times New Roman" w:hAnsiTheme="majorBidi" w:cstheme="majorBidi"/>
+          <w:b/>
+          <w:bCs/>
+          <w:color w:val="27251E"/>
+          <w:sz w:val="24"/>
+          <w:szCs w:val="24"/>
+          <w:lang w:val="en-US"/>
         </w:rPr>
         <w:t>1. The basic idea</w:t>
       </w:r>
@@ -108,16 +68,16 @@
           <w:color w:val="27251E"/>
           <w:sz w:val="24"/>
           <w:szCs w:val="24"/>
-          <w:lang/>
-        </w:rPr>
-      </w:pPr>
-      <w:r>
-        <w:rPr>
-          <w:rFonts w:asciiTheme="majorBidi" w:eastAsia="Times New Roman" w:hAnsiTheme="majorBidi" w:cstheme="majorBidi"/>
-          <w:color w:val="27251E"/>
-          <w:sz w:val="24"/>
-          <w:szCs w:val="24"/>
-          <w:lang/>
+          <w:lang w:val="en-US"/>
+        </w:rPr>
+      </w:pPr>
+      <w:r>
+        <w:rPr>
+          <w:rFonts w:asciiTheme="majorBidi" w:eastAsia="Times New Roman" w:hAnsiTheme="majorBidi" w:cstheme="majorBidi"/>
+          <w:color w:val="27251E"/>
+          <w:sz w:val="24"/>
+          <w:szCs w:val="24"/>
+          <w:lang w:val="en-US"/>
         </w:rPr>
         <w:t>Client–server architecture is a model where one side, the </w:t>
       </w:r>
@@ -129,7 +89,7 @@
           <w:color w:val="27251E"/>
           <w:sz w:val="24"/>
           <w:szCs w:val="24"/>
-          <w:lang/>
+          <w:lang w:val="en-US"/>
         </w:rPr>
         <w:t>client</w:t>
       </w:r>
@@ -139,7 +99,7 @@
           <w:color w:val="27251E"/>
           <w:sz w:val="24"/>
           <w:szCs w:val="24"/>
-          <w:lang/>
+          <w:lang w:val="en-US"/>
         </w:rPr>
         <w:t>, sends requests, and the other side, the </w:t>
       </w:r>
@@ -151,7 +111,7 @@
           <w:color w:val="27251E"/>
           <w:sz w:val="24"/>
           <w:szCs w:val="24"/>
-          <w:lang/>
+          <w:lang w:val="en-US"/>
         </w:rPr>
         <w:t>server</w:t>
       </w:r>
@@ -161,7 +121,7 @@
           <w:color w:val="27251E"/>
           <w:sz w:val="24"/>
           <w:szCs w:val="24"/>
-          <w:lang/>
+          <w:lang w:val="en-US"/>
         </w:rPr>
         <w:t>, listens, processes those requests, and returns responses. This pattern is common in web applications, APIs, and database systems because it separates the requester from the service provider.</w:t>
       </w:r>
@@ -178,18 +138,18 @@
           <w:color w:val="27251E"/>
           <w:sz w:val="24"/>
           <w:szCs w:val="24"/>
-          <w:lang/>
-        </w:rPr>
-      </w:pPr>
-      <w:r>
-        <w:rPr>
-          <w:rFonts w:asciiTheme="majorBidi" w:eastAsia="Times New Roman" w:hAnsiTheme="majorBidi" w:cstheme="majorBidi"/>
-          <w:b/>
-          <w:bCs/>
-          <w:color w:val="27251E"/>
-          <w:sz w:val="24"/>
-          <w:szCs w:val="24"/>
-          <w:lang/>
+          <w:lang w:val="en-US"/>
+        </w:rPr>
+      </w:pPr>
+      <w:r>
+        <w:rPr>
+          <w:rFonts w:asciiTheme="majorBidi" w:eastAsia="Times New Roman" w:hAnsiTheme="majorBidi" w:cstheme="majorBidi"/>
+          <w:b/>
+          <w:bCs/>
+          <w:color w:val="27251E"/>
+          <w:sz w:val="24"/>
+          <w:szCs w:val="24"/>
+          <w:lang w:val="en-US"/>
         </w:rPr>
         <w:t>2. Simple illustration</w:t>
       </w:r>
@@ -203,16 +163,16 @@
           <w:color w:val="27251E"/>
           <w:sz w:val="24"/>
           <w:szCs w:val="24"/>
-          <w:lang/>
-        </w:rPr>
-      </w:pPr>
-      <w:r>
-        <w:rPr>
-          <w:rFonts w:asciiTheme="majorBidi" w:eastAsia="Times New Roman" w:hAnsiTheme="majorBidi" w:cstheme="majorBidi"/>
-          <w:color w:val="27251E"/>
-          <w:sz w:val="24"/>
-          <w:szCs w:val="24"/>
-          <w:lang/>
+          <w:lang w:val="en-US"/>
+        </w:rPr>
+      </w:pPr>
+      <w:r>
+        <w:rPr>
+          <w:rFonts w:asciiTheme="majorBidi" w:eastAsia="Times New Roman" w:hAnsiTheme="majorBidi" w:cstheme="majorBidi"/>
+          <w:color w:val="27251E"/>
+          <w:sz w:val="24"/>
+          <w:szCs w:val="24"/>
+          <w:lang w:val="en-US"/>
         </w:rPr>
         <w:t>Think of the model as a request–response exchange across a network.</w:t>
       </w:r>
@@ -226,7 +186,6 @@
           <w:color w:val="27251E"/>
           <w:sz w:val="24"/>
           <w:szCs w:val="24"/>
-          <w:lang/>
         </w:rPr>
       </w:pPr>
       <w:r>
@@ -293,19 +252,58 @@
           <w:color w:val="27251E"/>
           <w:sz w:val="24"/>
           <w:szCs w:val="24"/>
-          <w:lang/>
-        </w:rPr>
-      </w:pPr>
-      <w:r>
-        <w:rPr>
-          <w:rFonts w:asciiTheme="majorBidi" w:eastAsia="Times New Roman" w:hAnsiTheme="majorBidi" w:cstheme="majorBidi"/>
-          <w:color w:val="27251E"/>
-          <w:sz w:val="24"/>
-          <w:szCs w:val="24"/>
-          <w:lang/>
-        </w:rPr>
-        <w:t xml:space="preserve">The client can be a browser, terminal command, or database client utility, while the server can </w:t>
-      </w:r>
+          <w:lang w:val="en-US"/>
+        </w:rPr>
+      </w:pPr>
+      <w:r>
+        <w:rPr>
+          <w:rFonts w:asciiTheme="majorBidi" w:eastAsia="Times New Roman" w:hAnsiTheme="majorBidi" w:cstheme="majorBidi"/>
+          <w:color w:val="27251E"/>
+          <w:sz w:val="24"/>
+          <w:szCs w:val="24"/>
+          <w:lang w:val="en-US"/>
+        </w:rPr>
+        <w:t>The client can be a browser, terminal command, or database client utility, while the server can be a web server, API, or database engine. The network carries the request to the server and carries the response back to the client.</w:t>
+      </w:r>
+    </w:p>
+    <w:p>
+      <w:pPr>
+        <w:spacing w:before="100" w:beforeAutospacing="1" w:after="100" w:afterAutospacing="1" w:line="360" w:lineRule="auto"/>
+        <w:contextualSpacing/>
+        <w:outlineLvl w:val="1"/>
+        <w:rPr>
+          <w:rFonts w:asciiTheme="majorBidi" w:eastAsia="Times New Roman" w:hAnsiTheme="majorBidi" w:cstheme="majorBidi"/>
+          <w:b/>
+          <w:bCs/>
+          <w:color w:val="27251E"/>
+          <w:sz w:val="24"/>
+          <w:szCs w:val="24"/>
+        </w:rPr>
+      </w:pPr>
+      <w:r>
+        <w:rPr>
+          <w:rFonts w:asciiTheme="majorBidi" w:eastAsia="Times New Roman" w:hAnsiTheme="majorBidi" w:cstheme="majorBidi"/>
+          <w:b/>
+          <w:bCs/>
+          <w:color w:val="27251E"/>
+          <w:sz w:val="24"/>
+          <w:szCs w:val="24"/>
+        </w:rPr>
+        <w:t>3. Using curl -lv</w:t>
+      </w:r>
+    </w:p>
+    <w:p>
+      <w:pPr>
+        <w:spacing w:before="100" w:beforeAutospacing="1" w:after="100" w:afterAutospacing="1" w:line="360" w:lineRule="auto"/>
+        <w:contextualSpacing/>
+        <w:rPr>
+          <w:rFonts w:asciiTheme="majorBidi" w:eastAsia="Times New Roman" w:hAnsiTheme="majorBidi" w:cstheme="majorBidi"/>
+          <w:color w:val="27251E"/>
+          <w:sz w:val="24"/>
+          <w:szCs w:val="24"/>
+          <w:lang w:val="en-US"/>
+        </w:rPr>
+      </w:pPr>
       <w:proofErr w:type="gramStart"/>
       <w:r>
         <w:rPr>
@@ -313,9 +311,9 @@
           <w:color w:val="27251E"/>
           <w:sz w:val="24"/>
           <w:szCs w:val="24"/>
-          <w:lang/>
-        </w:rPr>
-        <w:t>be</w:t>
+          <w:lang w:val="en-US"/>
+        </w:rPr>
+        <w:t>curl</w:t>
       </w:r>
       <w:proofErr w:type="gramEnd"/>
       <w:r>
@@ -324,84 +322,7 @@
           <w:color w:val="27251E"/>
           <w:sz w:val="24"/>
           <w:szCs w:val="24"/>
-          <w:lang/>
-        </w:rPr>
-        <w:t xml:space="preserve"> a web server, API, or database engine. The network carries the request to the server and carries the response back to the client.</w:t>
-      </w:r>
-    </w:p>
-    <w:p>
-      <w:pPr>
-        <w:spacing w:before="100" w:beforeAutospacing="1" w:after="100" w:afterAutospacing="1" w:line="360" w:lineRule="auto"/>
-        <w:contextualSpacing/>
-        <w:outlineLvl w:val="1"/>
-        <w:rPr>
-          <w:rFonts w:asciiTheme="majorBidi" w:eastAsia="Times New Roman" w:hAnsiTheme="majorBidi" w:cstheme="majorBidi"/>
-          <w:b/>
-          <w:bCs/>
-          <w:color w:val="27251E"/>
-          <w:sz w:val="24"/>
-          <w:szCs w:val="24"/>
-          <w:lang/>
-        </w:rPr>
-      </w:pPr>
-      <w:r>
-        <w:rPr>
-          <w:rFonts w:asciiTheme="majorBidi" w:eastAsia="Times New Roman" w:hAnsiTheme="majorBidi" w:cstheme="majorBidi"/>
-          <w:b/>
-          <w:bCs/>
-          <w:color w:val="27251E"/>
-          <w:sz w:val="24"/>
-          <w:szCs w:val="24"/>
-          <w:lang/>
-        </w:rPr>
-        <w:t>3. Using curl -</w:t>
-      </w:r>
-      <w:proofErr w:type="spellStart"/>
-      <w:r>
-        <w:rPr>
-          <w:rFonts w:asciiTheme="majorBidi" w:eastAsia="Times New Roman" w:hAnsiTheme="majorBidi" w:cstheme="majorBidi"/>
-          <w:b/>
-          <w:bCs/>
-          <w:color w:val="27251E"/>
-          <w:sz w:val="24"/>
-          <w:szCs w:val="24"/>
-          <w:lang/>
-        </w:rPr>
-        <w:t>lv</w:t>
-      </w:r>
-      <w:proofErr w:type="spellEnd"/>
-    </w:p>
-    <w:p>
-      <w:pPr>
-        <w:spacing w:before="100" w:beforeAutospacing="1" w:after="100" w:afterAutospacing="1" w:line="360" w:lineRule="auto"/>
-        <w:contextualSpacing/>
-        <w:rPr>
-          <w:rFonts w:asciiTheme="majorBidi" w:eastAsia="Times New Roman" w:hAnsiTheme="majorBidi" w:cstheme="majorBidi"/>
-          <w:color w:val="27251E"/>
-          <w:sz w:val="24"/>
-          <w:szCs w:val="24"/>
-          <w:lang/>
-        </w:rPr>
-      </w:pPr>
-      <w:proofErr w:type="gramStart"/>
-      <w:r>
-        <w:rPr>
-          <w:rFonts w:asciiTheme="majorBidi" w:eastAsia="Times New Roman" w:hAnsiTheme="majorBidi" w:cstheme="majorBidi"/>
-          <w:color w:val="27251E"/>
-          <w:sz w:val="24"/>
-          <w:szCs w:val="24"/>
-          <w:lang/>
-        </w:rPr>
-        <w:t>curl</w:t>
-      </w:r>
-      <w:proofErr w:type="gramEnd"/>
-      <w:r>
-        <w:rPr>
-          <w:rFonts w:asciiTheme="majorBidi" w:eastAsia="Times New Roman" w:hAnsiTheme="majorBidi" w:cstheme="majorBidi"/>
-          <w:color w:val="27251E"/>
-          <w:sz w:val="24"/>
-          <w:szCs w:val="24"/>
-          <w:lang/>
+          <w:lang w:val="en-US"/>
         </w:rPr>
         <w:t> is a command-line client that sends requests to a server and displays the response, which makes it useful for seeing client–server communication directly. In verbose mode, it shows request and response details, including headers and connection information.</w:t>
       </w:r>
@@ -415,16 +336,14 @@
           <w:color w:val="27251E"/>
           <w:sz w:val="24"/>
           <w:szCs w:val="24"/>
-          <w:lang/>
-        </w:rPr>
-      </w:pPr>
-      <w:r>
-        <w:rPr>
-          <w:rFonts w:asciiTheme="majorBidi" w:eastAsia="Times New Roman" w:hAnsiTheme="majorBidi" w:cstheme="majorBidi"/>
-          <w:color w:val="27251E"/>
-          <w:sz w:val="24"/>
-          <w:szCs w:val="24"/>
-          <w:lang/>
+        </w:rPr>
+      </w:pPr>
+      <w:r>
+        <w:rPr>
+          <w:rFonts w:asciiTheme="majorBidi" w:eastAsia="Times New Roman" w:hAnsiTheme="majorBidi" w:cstheme="majorBidi"/>
+          <w:color w:val="27251E"/>
+          <w:sz w:val="24"/>
+          <w:szCs w:val="24"/>
         </w:rPr>
         <w:t>Example:</w:t>
       </w:r>
@@ -456,7 +375,7 @@
           <w:color w:val="D6D5D4"/>
           <w:sz w:val="24"/>
           <w:szCs w:val="24"/>
-          <w:lang/>
+          <w:lang w:val="en-US"/>
         </w:rPr>
       </w:pPr>
       <w:proofErr w:type="gramStart"/>
@@ -466,7 +385,7 @@
           <w:color w:val="D6D5D4"/>
           <w:sz w:val="24"/>
           <w:szCs w:val="24"/>
-          <w:lang/>
+          <w:lang w:val="en-US"/>
         </w:rPr>
         <w:t>bash</w:t>
       </w:r>
@@ -499,7 +418,7 @@
           <w:color w:val="D6D5D4"/>
           <w:sz w:val="24"/>
           <w:szCs w:val="24"/>
-          <w:lang/>
+          <w:lang w:val="en-US"/>
         </w:rPr>
       </w:pPr>
       <w:proofErr w:type="gramStart"/>
@@ -509,7 +428,7 @@
           <w:color w:val="953800"/>
           <w:sz w:val="24"/>
           <w:szCs w:val="24"/>
-          <w:lang/>
+          <w:lang w:val="en-US"/>
         </w:rPr>
         <w:t>curl</w:t>
       </w:r>
@@ -520,52 +439,30 @@
           <w:color w:val="3F3B35"/>
           <w:sz w:val="24"/>
           <w:szCs w:val="24"/>
-          <w:lang/>
-        </w:rPr>
-        <w:t xml:space="preserve"> -</w:t>
-      </w:r>
-      <w:proofErr w:type="spellStart"/>
-      <w:r>
-        <w:rPr>
-          <w:rFonts w:asciiTheme="majorBidi" w:eastAsia="Times New Roman" w:hAnsiTheme="majorBidi" w:cstheme="majorBidi"/>
-          <w:color w:val="3F3B35"/>
-          <w:sz w:val="24"/>
-          <w:szCs w:val="24"/>
-          <w:lang/>
-        </w:rPr>
-        <w:t>lv</w:t>
-      </w:r>
-      <w:proofErr w:type="spellEnd"/>
-      <w:r>
-        <w:rPr>
-          <w:rFonts w:asciiTheme="majorBidi" w:eastAsia="Times New Roman" w:hAnsiTheme="majorBidi" w:cstheme="majorBidi"/>
-          <w:color w:val="3F3B35"/>
-          <w:sz w:val="24"/>
-          <w:szCs w:val="24"/>
-          <w:lang/>
-        </w:rPr>
-        <w:t xml:space="preserve"> https://example.com</w:t>
-      </w:r>
-    </w:p>
-    <w:p>
-      <w:pPr>
-        <w:spacing w:before="100" w:beforeAutospacing="1" w:after="100" w:afterAutospacing="1" w:line="360" w:lineRule="auto"/>
-        <w:contextualSpacing/>
-        <w:rPr>
-          <w:rFonts w:asciiTheme="majorBidi" w:eastAsia="Times New Roman" w:hAnsiTheme="majorBidi" w:cstheme="majorBidi"/>
-          <w:color w:val="27251E"/>
-          <w:sz w:val="24"/>
-          <w:szCs w:val="24"/>
-          <w:lang/>
-        </w:rPr>
-      </w:pPr>
-      <w:r>
-        <w:rPr>
-          <w:rFonts w:asciiTheme="majorBidi" w:eastAsia="Times New Roman" w:hAnsiTheme="majorBidi" w:cstheme="majorBidi"/>
-          <w:color w:val="27251E"/>
-          <w:sz w:val="24"/>
-          <w:szCs w:val="24"/>
-          <w:lang/>
+          <w:lang w:val="en-US"/>
+        </w:rPr>
+        <w:t xml:space="preserve"> -lv https://example.com</w:t>
+      </w:r>
+    </w:p>
+    <w:p>
+      <w:pPr>
+        <w:spacing w:before="100" w:beforeAutospacing="1" w:after="100" w:afterAutospacing="1" w:line="360" w:lineRule="auto"/>
+        <w:contextualSpacing/>
+        <w:rPr>
+          <w:rFonts w:asciiTheme="majorBidi" w:eastAsia="Times New Roman" w:hAnsiTheme="majorBidi" w:cstheme="majorBidi"/>
+          <w:color w:val="27251E"/>
+          <w:sz w:val="24"/>
+          <w:szCs w:val="24"/>
+          <w:lang w:val="en-US"/>
+        </w:rPr>
+      </w:pPr>
+      <w:r>
+        <w:rPr>
+          <w:rFonts w:asciiTheme="majorBidi" w:eastAsia="Times New Roman" w:hAnsiTheme="majorBidi" w:cstheme="majorBidi"/>
+          <w:color w:val="27251E"/>
+          <w:sz w:val="24"/>
+          <w:szCs w:val="24"/>
+          <w:lang w:val="en-US"/>
         </w:rPr>
         <w:t>Here, your machine is the </w:t>
       </w:r>
@@ -577,7 +474,7 @@
           <w:color w:val="27251E"/>
           <w:sz w:val="24"/>
           <w:szCs w:val="24"/>
-          <w:lang/>
+          <w:lang w:val="en-US"/>
         </w:rPr>
         <w:t>client</w:t>
       </w:r>
@@ -587,7 +484,7 @@
           <w:color w:val="27251E"/>
           <w:sz w:val="24"/>
           <w:szCs w:val="24"/>
-          <w:lang/>
+          <w:lang w:val="en-US"/>
         </w:rPr>
         <w:t>, example.com is the </w:t>
       </w:r>
@@ -599,7 +496,7 @@
           <w:color w:val="27251E"/>
           <w:sz w:val="24"/>
           <w:szCs w:val="24"/>
-          <w:lang/>
+          <w:lang w:val="en-US"/>
         </w:rPr>
         <w:t>server</w:t>
       </w:r>
@@ -609,7 +506,7 @@
           <w:color w:val="27251E"/>
           <w:sz w:val="24"/>
           <w:szCs w:val="24"/>
-          <w:lang/>
+          <w:lang w:val="en-US"/>
         </w:rPr>
         <w:t>, and HTTP/HTTPS is the protocol used between them. In the verbose output, lines beginning with &gt; are sent by the client, while lines beginning with &lt; are returned by the server.</w:t>
       </w:r>
@@ -626,92 +523,54 @@
           <w:color w:val="27251E"/>
           <w:sz w:val="24"/>
           <w:szCs w:val="24"/>
-          <w:lang/>
-        </w:rPr>
-      </w:pPr>
-      <w:r>
-        <w:rPr>
-          <w:rFonts w:asciiTheme="majorBidi" w:eastAsia="Times New Roman" w:hAnsiTheme="majorBidi" w:cstheme="majorBidi"/>
-          <w:b/>
-          <w:bCs/>
-          <w:color w:val="27251E"/>
-          <w:sz w:val="24"/>
-          <w:szCs w:val="24"/>
-          <w:lang/>
-        </w:rPr>
-        <w:t xml:space="preserve">4. </w:t>
-      </w:r>
-      <w:proofErr w:type="spellStart"/>
-      <w:r>
-        <w:rPr>
-          <w:rFonts w:asciiTheme="majorBidi" w:eastAsia="Times New Roman" w:hAnsiTheme="majorBidi" w:cstheme="majorBidi"/>
-          <w:b/>
-          <w:bCs/>
-          <w:color w:val="27251E"/>
-          <w:sz w:val="24"/>
-          <w:szCs w:val="24"/>
-          <w:lang/>
-        </w:rPr>
-        <w:t>MySQL</w:t>
-      </w:r>
-      <w:proofErr w:type="spellEnd"/>
-      <w:r>
-        <w:rPr>
-          <w:rFonts w:asciiTheme="majorBidi" w:eastAsia="Times New Roman" w:hAnsiTheme="majorBidi" w:cstheme="majorBidi"/>
-          <w:b/>
-          <w:bCs/>
-          <w:color w:val="27251E"/>
-          <w:sz w:val="24"/>
-          <w:szCs w:val="24"/>
-          <w:lang/>
-        </w:rPr>
-        <w:t xml:space="preserve"> as a client–server application</w:t>
-      </w:r>
-    </w:p>
-    <w:p>
-      <w:pPr>
-        <w:spacing w:before="100" w:beforeAutospacing="1" w:after="100" w:afterAutospacing="1" w:line="360" w:lineRule="auto"/>
-        <w:contextualSpacing/>
-        <w:rPr>
-          <w:rFonts w:asciiTheme="majorBidi" w:eastAsia="Times New Roman" w:hAnsiTheme="majorBidi" w:cstheme="majorBidi"/>
-          <w:color w:val="27251E"/>
-          <w:sz w:val="24"/>
-          <w:szCs w:val="24"/>
-          <w:lang/>
-        </w:rPr>
-      </w:pPr>
-      <w:proofErr w:type="spellStart"/>
-      <w:r>
-        <w:rPr>
-          <w:rFonts w:asciiTheme="majorBidi" w:eastAsia="Times New Roman" w:hAnsiTheme="majorBidi" w:cstheme="majorBidi"/>
-          <w:color w:val="27251E"/>
-          <w:sz w:val="24"/>
-          <w:szCs w:val="24"/>
-          <w:lang/>
+          <w:lang w:val="en-US"/>
+        </w:rPr>
+      </w:pPr>
+      <w:r>
+        <w:rPr>
+          <w:rFonts w:asciiTheme="majorBidi" w:eastAsia="Times New Roman" w:hAnsiTheme="majorBidi" w:cstheme="majorBidi"/>
+          <w:b/>
+          <w:bCs/>
+          <w:color w:val="27251E"/>
+          <w:sz w:val="24"/>
+          <w:szCs w:val="24"/>
+          <w:lang w:val="en-US"/>
+        </w:rPr>
+        <w:t>4. MySQL as a client–server application</w:t>
+      </w:r>
+    </w:p>
+    <w:p>
+      <w:pPr>
+        <w:spacing w:before="100" w:beforeAutospacing="1" w:after="100" w:afterAutospacing="1" w:line="360" w:lineRule="auto"/>
+        <w:contextualSpacing/>
+        <w:rPr>
+          <w:rFonts w:asciiTheme="majorBidi" w:eastAsia="Times New Roman" w:hAnsiTheme="majorBidi" w:cstheme="majorBidi"/>
+          <w:color w:val="27251E"/>
+          <w:sz w:val="24"/>
+          <w:szCs w:val="24"/>
+          <w:lang w:val="en-US"/>
+        </w:rPr>
+      </w:pPr>
+      <w:r>
+        <w:rPr>
+          <w:rFonts w:asciiTheme="majorBidi" w:eastAsia="Times New Roman" w:hAnsiTheme="majorBidi" w:cstheme="majorBidi"/>
+          <w:color w:val="27251E"/>
+          <w:sz w:val="24"/>
+          <w:szCs w:val="24"/>
+          <w:lang w:val="en-US"/>
         </w:rPr>
         <w:lastRenderedPageBreak/>
-        <w:t>MySQL</w:t>
-      </w:r>
-      <w:proofErr w:type="spellEnd"/>
-      <w:r>
-        <w:rPr>
-          <w:rFonts w:asciiTheme="majorBidi" w:eastAsia="Times New Roman" w:hAnsiTheme="majorBidi" w:cstheme="majorBidi"/>
-          <w:color w:val="27251E"/>
-          <w:sz w:val="24"/>
-          <w:szCs w:val="24"/>
-          <w:lang/>
-        </w:rPr>
-        <w:t xml:space="preserve"> is also a </w:t>
-      </w:r>
-      <w:r>
-        <w:rPr>
-          <w:rFonts w:asciiTheme="majorBidi" w:eastAsia="Times New Roman" w:hAnsiTheme="majorBidi" w:cstheme="majorBidi"/>
-          <w:b/>
-          <w:bCs/>
-          <w:color w:val="27251E"/>
-          <w:sz w:val="24"/>
-          <w:szCs w:val="24"/>
-          <w:lang/>
+        <w:t>MySQL is also a </w:t>
+      </w:r>
+      <w:r>
+        <w:rPr>
+          <w:rFonts w:asciiTheme="majorBidi" w:eastAsia="Times New Roman" w:hAnsiTheme="majorBidi" w:cstheme="majorBidi"/>
+          <w:b/>
+          <w:bCs/>
+          <w:color w:val="27251E"/>
+          <w:sz w:val="24"/>
+          <w:szCs w:val="24"/>
+          <w:lang w:val="en-US"/>
         </w:rPr>
         <w:t>client–server system</w:t>
       </w:r>
@@ -721,118 +580,30 @@
           <w:color w:val="27251E"/>
           <w:sz w:val="24"/>
           <w:szCs w:val="24"/>
-          <w:lang/>
-        </w:rPr>
-        <w:t xml:space="preserve">: the </w:t>
-      </w:r>
-      <w:proofErr w:type="spellStart"/>
-      <w:r>
-        <w:rPr>
-          <w:rFonts w:asciiTheme="majorBidi" w:eastAsia="Times New Roman" w:hAnsiTheme="majorBidi" w:cstheme="majorBidi"/>
-          <w:color w:val="27251E"/>
-          <w:sz w:val="24"/>
-          <w:szCs w:val="24"/>
-          <w:lang/>
-        </w:rPr>
-        <w:t>MySQL</w:t>
-      </w:r>
-      <w:proofErr w:type="spellEnd"/>
-      <w:r>
-        <w:rPr>
-          <w:rFonts w:asciiTheme="majorBidi" w:eastAsia="Times New Roman" w:hAnsiTheme="majorBidi" w:cstheme="majorBidi"/>
-          <w:color w:val="27251E"/>
-          <w:sz w:val="24"/>
-          <w:szCs w:val="24"/>
-          <w:lang/>
-        </w:rPr>
-        <w:t xml:space="preserve"> client sends SQL queries to the </w:t>
-      </w:r>
-      <w:proofErr w:type="spellStart"/>
-      <w:r>
-        <w:rPr>
-          <w:rFonts w:asciiTheme="majorBidi" w:eastAsia="Times New Roman" w:hAnsiTheme="majorBidi" w:cstheme="majorBidi"/>
-          <w:color w:val="27251E"/>
-          <w:sz w:val="24"/>
-          <w:szCs w:val="24"/>
-          <w:lang/>
-        </w:rPr>
-        <w:t>MySQL</w:t>
-      </w:r>
-      <w:proofErr w:type="spellEnd"/>
-      <w:r>
-        <w:rPr>
-          <w:rFonts w:asciiTheme="majorBidi" w:eastAsia="Times New Roman" w:hAnsiTheme="majorBidi" w:cstheme="majorBidi"/>
-          <w:color w:val="27251E"/>
-          <w:sz w:val="24"/>
-          <w:szCs w:val="24"/>
-          <w:lang/>
-        </w:rPr>
-        <w:t xml:space="preserve"> server, and the server processes them and returns results. In a common setup, one machine runs the </w:t>
-      </w:r>
-      <w:proofErr w:type="spellStart"/>
-      <w:r>
-        <w:rPr>
-          <w:rFonts w:asciiTheme="majorBidi" w:eastAsia="Times New Roman" w:hAnsiTheme="majorBidi" w:cstheme="majorBidi"/>
-          <w:color w:val="27251E"/>
-          <w:sz w:val="24"/>
-          <w:szCs w:val="24"/>
-          <w:lang/>
-        </w:rPr>
-        <w:t>MySQL</w:t>
-      </w:r>
-      <w:proofErr w:type="spellEnd"/>
-      <w:r>
-        <w:rPr>
-          <w:rFonts w:asciiTheme="majorBidi" w:eastAsia="Times New Roman" w:hAnsiTheme="majorBidi" w:cstheme="majorBidi"/>
-          <w:color w:val="27251E"/>
-          <w:sz w:val="24"/>
-          <w:szCs w:val="24"/>
-          <w:lang/>
-        </w:rPr>
-        <w:t xml:space="preserve"> server process, while another machine or terminal uses the </w:t>
-      </w:r>
-      <w:proofErr w:type="spellStart"/>
-      <w:r>
-        <w:rPr>
-          <w:rFonts w:asciiTheme="majorBidi" w:eastAsia="Times New Roman" w:hAnsiTheme="majorBidi" w:cstheme="majorBidi"/>
-          <w:color w:val="27251E"/>
-          <w:sz w:val="24"/>
-          <w:szCs w:val="24"/>
-          <w:lang/>
-        </w:rPr>
-        <w:t>MySQL</w:t>
-      </w:r>
-      <w:proofErr w:type="spellEnd"/>
-      <w:r>
-        <w:rPr>
-          <w:rFonts w:asciiTheme="majorBidi" w:eastAsia="Times New Roman" w:hAnsiTheme="majorBidi" w:cstheme="majorBidi"/>
-          <w:color w:val="27251E"/>
-          <w:sz w:val="24"/>
-          <w:szCs w:val="24"/>
-          <w:lang/>
-        </w:rPr>
-        <w:t xml:space="preserve"> client to connect remotely over TCP port 3306.</w:t>
-      </w:r>
-    </w:p>
-    <w:p>
-      <w:pPr>
-        <w:spacing w:before="100" w:beforeAutospacing="1" w:after="100" w:afterAutospacing="1" w:line="360" w:lineRule="auto"/>
-        <w:contextualSpacing/>
-        <w:rPr>
-          <w:rFonts w:asciiTheme="majorBidi" w:eastAsia="Times New Roman" w:hAnsiTheme="majorBidi" w:cstheme="majorBidi"/>
-          <w:color w:val="27251E"/>
-          <w:sz w:val="24"/>
-          <w:szCs w:val="24"/>
-          <w:lang/>
-        </w:rPr>
-      </w:pPr>
-      <w:r>
-        <w:rPr>
-          <w:rFonts w:asciiTheme="majorBidi" w:eastAsia="Times New Roman" w:hAnsiTheme="majorBidi" w:cstheme="majorBidi"/>
-          <w:color w:val="27251E"/>
-          <w:sz w:val="24"/>
-          <w:szCs w:val="24"/>
-          <w:lang/>
+          <w:lang w:val="en-US"/>
+        </w:rPr>
+        <w:t>: the MySQL client sends SQL queries to the MySQL server, and the server processes them and returns results. In a common setup, one machine runs the MySQL server process, while another machine or terminal uses the MySQL client to connect remotely over TCP port 3306.</w:t>
+      </w:r>
+    </w:p>
+    <w:p>
+      <w:pPr>
+        <w:spacing w:before="100" w:beforeAutospacing="1" w:after="100" w:afterAutospacing="1" w:line="360" w:lineRule="auto"/>
+        <w:contextualSpacing/>
+        <w:rPr>
+          <w:rFonts w:asciiTheme="majorBidi" w:eastAsia="Times New Roman" w:hAnsiTheme="majorBidi" w:cstheme="majorBidi"/>
+          <w:color w:val="27251E"/>
+          <w:sz w:val="24"/>
+          <w:szCs w:val="24"/>
+          <w:lang w:val="en-US"/>
+        </w:rPr>
+      </w:pPr>
+      <w:r>
+        <w:rPr>
+          <w:rFonts w:asciiTheme="majorBidi" w:eastAsia="Times New Roman" w:hAnsiTheme="majorBidi" w:cstheme="majorBidi"/>
+          <w:color w:val="27251E"/>
+          <w:sz w:val="24"/>
+          <w:szCs w:val="24"/>
+          <w:lang w:val="en-US"/>
         </w:rPr>
         <w:t>A typical remote connection looks like this:</w:t>
       </w:r>
@@ -864,7 +635,7 @@
           <w:color w:val="D6D5D4"/>
           <w:sz w:val="24"/>
           <w:szCs w:val="24"/>
-          <w:lang/>
+          <w:lang w:val="en-US"/>
         </w:rPr>
       </w:pPr>
       <w:proofErr w:type="gramStart"/>
@@ -874,7 +645,7 @@
           <w:color w:val="D6D5D4"/>
           <w:sz w:val="24"/>
           <w:szCs w:val="24"/>
-          <w:lang/>
+          <w:lang w:val="en-US"/>
         </w:rPr>
         <w:t>bash</w:t>
       </w:r>
@@ -907,10 +678,9 @@
           <w:color w:val="D6D5D4"/>
           <w:sz w:val="24"/>
           <w:szCs w:val="24"/>
-          <w:lang/>
-        </w:rPr>
-      </w:pPr>
-      <w:proofErr w:type="spellStart"/>
+          <w:lang w:val="en-US"/>
+        </w:rPr>
+      </w:pPr>
       <w:proofErr w:type="gramStart"/>
       <w:r>
         <w:rPr>
@@ -918,11 +688,10 @@
           <w:color w:val="3F3B35"/>
           <w:sz w:val="24"/>
           <w:szCs w:val="24"/>
-          <w:lang/>
+          <w:lang w:val="en-US"/>
         </w:rPr>
         <w:t>mysql</w:t>
       </w:r>
-      <w:proofErr w:type="spellEnd"/>
       <w:proofErr w:type="gramEnd"/>
       <w:r>
         <w:rPr>
@@ -930,86 +699,42 @@
           <w:color w:val="3F3B35"/>
           <w:sz w:val="24"/>
           <w:szCs w:val="24"/>
-          <w:lang/>
-        </w:rPr>
-        <w:t xml:space="preserve"> -u username -h </w:t>
-      </w:r>
-      <w:proofErr w:type="spellStart"/>
-      <w:r>
-        <w:rPr>
-          <w:rFonts w:asciiTheme="majorBidi" w:eastAsia="Times New Roman" w:hAnsiTheme="majorBidi" w:cstheme="majorBidi"/>
-          <w:color w:val="3F3B35"/>
-          <w:sz w:val="24"/>
-          <w:szCs w:val="24"/>
-          <w:lang/>
-        </w:rPr>
-        <w:t>server_ip</w:t>
-      </w:r>
-      <w:proofErr w:type="spellEnd"/>
-      <w:r>
-        <w:rPr>
-          <w:rFonts w:asciiTheme="majorBidi" w:eastAsia="Times New Roman" w:hAnsiTheme="majorBidi" w:cstheme="majorBidi"/>
-          <w:color w:val="3F3B35"/>
-          <w:sz w:val="24"/>
-          <w:szCs w:val="24"/>
-          <w:lang/>
-        </w:rPr>
-        <w:t xml:space="preserve"> -p</w:t>
-      </w:r>
-    </w:p>
-    <w:p>
-      <w:pPr>
-        <w:spacing w:before="100" w:beforeAutospacing="1" w:after="100" w:afterAutospacing="1" w:line="360" w:lineRule="auto"/>
-        <w:contextualSpacing/>
-        <w:rPr>
-          <w:rFonts w:asciiTheme="majorBidi" w:eastAsia="Times New Roman" w:hAnsiTheme="majorBidi" w:cstheme="majorBidi"/>
-          <w:color w:val="27251E"/>
-          <w:sz w:val="24"/>
-          <w:szCs w:val="24"/>
-          <w:lang/>
-        </w:rPr>
-      </w:pPr>
-      <w:r>
-        <w:rPr>
-          <w:rFonts w:asciiTheme="majorBidi" w:eastAsia="Times New Roman" w:hAnsiTheme="majorBidi" w:cstheme="majorBidi"/>
-          <w:color w:val="27251E"/>
-          <w:sz w:val="24"/>
-          <w:szCs w:val="24"/>
-          <w:lang/>
-        </w:rPr>
-        <w:t>In this interaction, the </w:t>
-      </w:r>
-      <w:proofErr w:type="spellStart"/>
-      <w:r>
-        <w:rPr>
-          <w:rFonts w:asciiTheme="majorBidi" w:eastAsia="Times New Roman" w:hAnsiTheme="majorBidi" w:cstheme="majorBidi"/>
-          <w:color w:val="27251E"/>
-          <w:sz w:val="24"/>
-          <w:szCs w:val="24"/>
-          <w:lang/>
-        </w:rPr>
-        <w:t>mysql</w:t>
-      </w:r>
-      <w:proofErr w:type="spellEnd"/>
-      <w:r>
-        <w:rPr>
-          <w:rFonts w:asciiTheme="majorBidi" w:eastAsia="Times New Roman" w:hAnsiTheme="majorBidi" w:cstheme="majorBidi"/>
-          <w:color w:val="27251E"/>
-          <w:sz w:val="24"/>
-          <w:szCs w:val="24"/>
-          <w:lang/>
-        </w:rPr>
-        <w:t> command is the </w:t>
-      </w:r>
-      <w:r>
-        <w:rPr>
-          <w:rFonts w:asciiTheme="majorBidi" w:eastAsia="Times New Roman" w:hAnsiTheme="majorBidi" w:cstheme="majorBidi"/>
-          <w:b/>
-          <w:bCs/>
-          <w:color w:val="27251E"/>
-          <w:sz w:val="24"/>
-          <w:szCs w:val="24"/>
-          <w:lang/>
+          <w:lang w:val="en-US"/>
+        </w:rPr>
+        <w:t xml:space="preserve"> -u username -h server_ip -p</w:t>
+      </w:r>
+    </w:p>
+    <w:p>
+      <w:pPr>
+        <w:spacing w:before="100" w:beforeAutospacing="1" w:after="100" w:afterAutospacing="1" w:line="360" w:lineRule="auto"/>
+        <w:contextualSpacing/>
+        <w:rPr>
+          <w:rFonts w:asciiTheme="majorBidi" w:eastAsia="Times New Roman" w:hAnsiTheme="majorBidi" w:cstheme="majorBidi"/>
+          <w:color w:val="27251E"/>
+          <w:sz w:val="24"/>
+          <w:szCs w:val="24"/>
+          <w:lang w:val="en-US"/>
+        </w:rPr>
+      </w:pPr>
+      <w:r>
+        <w:rPr>
+          <w:rFonts w:asciiTheme="majorBidi" w:eastAsia="Times New Roman" w:hAnsiTheme="majorBidi" w:cstheme="majorBidi"/>
+          <w:color w:val="27251E"/>
+          <w:sz w:val="24"/>
+          <w:szCs w:val="24"/>
+          <w:lang w:val="en-US"/>
+        </w:rPr>
+        <w:t>In this interaction, the mysql command is the </w:t>
+      </w:r>
+      <w:r>
+        <w:rPr>
+          <w:rFonts w:asciiTheme="majorBidi" w:eastAsia="Times New Roman" w:hAnsiTheme="majorBidi" w:cstheme="majorBidi"/>
+          <w:b/>
+          <w:bCs/>
+          <w:color w:val="27251E"/>
+          <w:sz w:val="24"/>
+          <w:szCs w:val="24"/>
+          <w:lang w:val="en-US"/>
         </w:rPr>
         <w:t>client</w:t>
       </w:r>
@@ -1019,41 +744,19 @@
           <w:color w:val="27251E"/>
           <w:sz w:val="24"/>
           <w:szCs w:val="24"/>
-          <w:lang/>
-        </w:rPr>
-        <w:t xml:space="preserve">, the </w:t>
-      </w:r>
-      <w:proofErr w:type="spellStart"/>
-      <w:r>
-        <w:rPr>
-          <w:rFonts w:asciiTheme="majorBidi" w:eastAsia="Times New Roman" w:hAnsiTheme="majorBidi" w:cstheme="majorBidi"/>
-          <w:color w:val="27251E"/>
-          <w:sz w:val="24"/>
-          <w:szCs w:val="24"/>
-          <w:lang/>
-        </w:rPr>
-        <w:t>MySQL</w:t>
-      </w:r>
-      <w:proofErr w:type="spellEnd"/>
-      <w:r>
-        <w:rPr>
-          <w:rFonts w:asciiTheme="majorBidi" w:eastAsia="Times New Roman" w:hAnsiTheme="majorBidi" w:cstheme="majorBidi"/>
-          <w:color w:val="27251E"/>
-          <w:sz w:val="24"/>
-          <w:szCs w:val="24"/>
-          <w:lang/>
-        </w:rPr>
-        <w:t xml:space="preserve"> daemon is the </w:t>
-      </w:r>
-      <w:r>
-        <w:rPr>
-          <w:rFonts w:asciiTheme="majorBidi" w:eastAsia="Times New Roman" w:hAnsiTheme="majorBidi" w:cstheme="majorBidi"/>
-          <w:b/>
-          <w:bCs/>
-          <w:color w:val="27251E"/>
-          <w:sz w:val="24"/>
-          <w:szCs w:val="24"/>
-          <w:lang/>
+          <w:lang w:val="en-US"/>
+        </w:rPr>
+        <w:t>, the MySQL daemon is the </w:t>
+      </w:r>
+      <w:r>
+        <w:rPr>
+          <w:rFonts w:asciiTheme="majorBidi" w:eastAsia="Times New Roman" w:hAnsiTheme="majorBidi" w:cstheme="majorBidi"/>
+          <w:b/>
+          <w:bCs/>
+          <w:color w:val="27251E"/>
+          <w:sz w:val="24"/>
+          <w:szCs w:val="24"/>
+          <w:lang w:val="en-US"/>
         </w:rPr>
         <w:t>server</w:t>
       </w:r>
@@ -1063,7 +766,7 @@
           <w:color w:val="27251E"/>
           <w:sz w:val="24"/>
           <w:szCs w:val="24"/>
-          <w:lang/>
+          <w:lang w:val="en-US"/>
         </w:rPr>
         <w:t>, and SQL is the language used to communicate with the database service.</w:t>
       </w:r>
@@ -1080,79 +783,43 @@
           <w:color w:val="27251E"/>
           <w:sz w:val="24"/>
           <w:szCs w:val="24"/>
-          <w:lang/>
-        </w:rPr>
-      </w:pPr>
-      <w:r>
-        <w:rPr>
-          <w:rFonts w:asciiTheme="majorBidi" w:eastAsia="Times New Roman" w:hAnsiTheme="majorBidi" w:cstheme="majorBidi"/>
-          <w:b/>
-          <w:bCs/>
-          <w:color w:val="27251E"/>
-          <w:sz w:val="24"/>
-          <w:szCs w:val="24"/>
-          <w:lang/>
-        </w:rPr>
-        <w:t xml:space="preserve">5. Mini SQL </w:t>
-      </w:r>
-      <w:proofErr w:type="spellStart"/>
-      <w:r>
-        <w:rPr>
-          <w:rFonts w:asciiTheme="majorBidi" w:eastAsia="Times New Roman" w:hAnsiTheme="majorBidi" w:cstheme="majorBidi"/>
-          <w:b/>
-          <w:bCs/>
-          <w:color w:val="27251E"/>
-          <w:sz w:val="24"/>
-          <w:szCs w:val="24"/>
-          <w:lang/>
-        </w:rPr>
-        <w:t>cheatsheet</w:t>
-      </w:r>
-      <w:proofErr w:type="spellEnd"/>
-    </w:p>
-    <w:p>
-      <w:pPr>
-        <w:spacing w:before="100" w:beforeAutospacing="1" w:after="100" w:afterAutospacing="1" w:line="360" w:lineRule="auto"/>
-        <w:contextualSpacing/>
-        <w:rPr>
-          <w:rFonts w:asciiTheme="majorBidi" w:eastAsia="Times New Roman" w:hAnsiTheme="majorBidi" w:cstheme="majorBidi"/>
-          <w:color w:val="27251E"/>
-          <w:sz w:val="24"/>
-          <w:szCs w:val="24"/>
-          <w:lang/>
-        </w:rPr>
-      </w:pPr>
-      <w:r>
-        <w:rPr>
-          <w:rFonts w:asciiTheme="majorBidi" w:eastAsia="Times New Roman" w:hAnsiTheme="majorBidi" w:cstheme="majorBidi"/>
-          <w:color w:val="27251E"/>
-          <w:sz w:val="24"/>
-          <w:szCs w:val="24"/>
-          <w:lang/>
-        </w:rPr>
-        <w:t xml:space="preserve">Once connected to </w:t>
-      </w:r>
-      <w:proofErr w:type="spellStart"/>
-      <w:r>
-        <w:rPr>
-          <w:rFonts w:asciiTheme="majorBidi" w:eastAsia="Times New Roman" w:hAnsiTheme="majorBidi" w:cstheme="majorBidi"/>
-          <w:color w:val="27251E"/>
-          <w:sz w:val="24"/>
-          <w:szCs w:val="24"/>
-          <w:lang/>
-        </w:rPr>
-        <w:t>MySQL</w:t>
-      </w:r>
-      <w:proofErr w:type="spellEnd"/>
-      <w:r>
-        <w:rPr>
-          <w:rFonts w:asciiTheme="majorBidi" w:eastAsia="Times New Roman" w:hAnsiTheme="majorBidi" w:cstheme="majorBidi"/>
-          <w:color w:val="27251E"/>
-          <w:sz w:val="24"/>
-          <w:szCs w:val="24"/>
-          <w:lang/>
-        </w:rPr>
-        <w:t>, you can test the client–server interaction with a few basic SQL commands.</w:t>
+          <w:lang w:val="en-US"/>
+        </w:rPr>
+      </w:pPr>
+      <w:r>
+        <w:rPr>
+          <w:rFonts w:asciiTheme="majorBidi" w:eastAsia="Times New Roman" w:hAnsiTheme="majorBidi" w:cstheme="majorBidi"/>
+          <w:b/>
+          <w:bCs/>
+          <w:color w:val="27251E"/>
+          <w:sz w:val="24"/>
+          <w:szCs w:val="24"/>
+          <w:lang w:val="en-US"/>
+        </w:rPr>
+        <w:t>5. Mini SQL cheatsheet</w:t>
+      </w:r>
+    </w:p>
+    <w:p>
+      <w:pPr>
+        <w:spacing w:before="100" w:beforeAutospacing="1" w:after="100" w:afterAutospacing="1" w:line="360" w:lineRule="auto"/>
+        <w:contextualSpacing/>
+        <w:rPr>
+          <w:rFonts w:asciiTheme="majorBidi" w:eastAsia="Times New Roman" w:hAnsiTheme="majorBidi" w:cstheme="majorBidi"/>
+          <w:color w:val="27251E"/>
+          <w:sz w:val="24"/>
+          <w:szCs w:val="24"/>
+          <w:lang w:val="en-US"/>
+        </w:rPr>
+      </w:pPr>
+      <w:r>
+        <w:rPr>
+          <w:rFonts w:asciiTheme="majorBidi" w:eastAsia="Times New Roman" w:hAnsiTheme="majorBidi" w:cstheme="majorBidi"/>
+          <w:color w:val="27251E"/>
+          <w:sz w:val="24"/>
+          <w:szCs w:val="24"/>
+          <w:lang w:val="en-US"/>
+        </w:rPr>
+        <w:t>Once connected to MySQL, you can test the client–server interaction with a few basic SQL commands.</w:t>
       </w:r>
     </w:p>
     <w:p>
@@ -1182,10 +849,9 @@
           <w:color w:val="D6D5D4"/>
           <w:sz w:val="24"/>
           <w:szCs w:val="24"/>
-          <w:lang/>
-        </w:rPr>
-      </w:pPr>
-      <w:proofErr w:type="spellStart"/>
+          <w:lang w:val="en-US"/>
+        </w:rPr>
+      </w:pPr>
       <w:proofErr w:type="gramStart"/>
       <w:r>
         <w:rPr>
@@ -1193,11 +859,10 @@
           <w:color w:val="D6D5D4"/>
           <w:sz w:val="24"/>
           <w:szCs w:val="24"/>
-          <w:lang/>
+          <w:lang w:val="en-US"/>
         </w:rPr>
         <w:t>sql</w:t>
       </w:r>
-      <w:proofErr w:type="spellEnd"/>
       <w:proofErr w:type="gramEnd"/>
     </w:p>
     <w:p>
@@ -1227,7 +892,7 @@
           <w:color w:val="3F3B35"/>
           <w:sz w:val="24"/>
           <w:szCs w:val="24"/>
-          <w:lang/>
+          <w:lang w:val="en-US"/>
         </w:rPr>
       </w:pPr>
       <w:r>
@@ -1238,7 +903,7 @@
           <w:color w:val="CF222E"/>
           <w:sz w:val="24"/>
           <w:szCs w:val="24"/>
-          <w:lang/>
+          <w:lang w:val="en-US"/>
         </w:rPr>
         <w:t>SHOW</w:t>
       </w:r>
@@ -1248,7 +913,7 @@
           <w:color w:val="3F3B35"/>
           <w:sz w:val="24"/>
           <w:szCs w:val="24"/>
-          <w:lang/>
+          <w:lang w:val="en-US"/>
         </w:rPr>
         <w:t xml:space="preserve"> </w:t>
       </w:r>
@@ -1260,7 +925,7 @@
           <w:color w:val="CF222E"/>
           <w:sz w:val="24"/>
           <w:szCs w:val="24"/>
-          <w:lang/>
+          <w:lang w:val="en-US"/>
         </w:rPr>
         <w:t>DATABASES</w:t>
       </w:r>
@@ -1270,7 +935,7 @@
           <w:color w:val="3F3B35"/>
           <w:sz w:val="24"/>
           <w:szCs w:val="24"/>
-          <w:lang/>
+          <w:lang w:val="en-US"/>
         </w:rPr>
         <w:t>;</w:t>
       </w:r>
@@ -1302,7 +967,7 @@
           <w:color w:val="3F3B35"/>
           <w:sz w:val="24"/>
           <w:szCs w:val="24"/>
-          <w:lang/>
+          <w:lang w:val="en-US"/>
         </w:rPr>
       </w:pPr>
       <w:r>
@@ -1313,7 +978,7 @@
           <w:color w:val="CF222E"/>
           <w:sz w:val="24"/>
           <w:szCs w:val="24"/>
-          <w:lang/>
+          <w:lang w:val="en-US"/>
         </w:rPr>
         <w:t>CREATE</w:t>
       </w:r>
@@ -1323,7 +988,7 @@
           <w:color w:val="3F3B35"/>
           <w:sz w:val="24"/>
           <w:szCs w:val="24"/>
-          <w:lang/>
+          <w:lang w:val="en-US"/>
         </w:rPr>
         <w:t xml:space="preserve"> </w:t>
       </w:r>
@@ -1335,7 +1000,7 @@
           <w:color w:val="CF222E"/>
           <w:sz w:val="24"/>
           <w:szCs w:val="24"/>
-          <w:lang/>
+          <w:lang w:val="en-US"/>
         </w:rPr>
         <w:t>DATABASE</w:t>
       </w:r>
@@ -1345,7 +1010,7 @@
           <w:color w:val="3F3B35"/>
           <w:sz w:val="24"/>
           <w:szCs w:val="24"/>
-          <w:lang/>
+          <w:lang w:val="en-US"/>
         </w:rPr>
         <w:t xml:space="preserve"> bookstore;</w:t>
       </w:r>
@@ -1377,7 +1042,7 @@
           <w:color w:val="3F3B35"/>
           <w:sz w:val="24"/>
           <w:szCs w:val="24"/>
-          <w:lang/>
+          <w:lang w:val="en-US"/>
         </w:rPr>
       </w:pPr>
       <w:r>
@@ -1388,7 +1053,7 @@
           <w:color w:val="CF222E"/>
           <w:sz w:val="24"/>
           <w:szCs w:val="24"/>
-          <w:lang/>
+          <w:lang w:val="en-US"/>
         </w:rPr>
         <w:t>USE</w:t>
       </w:r>
@@ -1398,7 +1063,7 @@
           <w:color w:val="3F3B35"/>
           <w:sz w:val="24"/>
           <w:szCs w:val="24"/>
-          <w:lang/>
+          <w:lang w:val="en-US"/>
         </w:rPr>
         <w:t xml:space="preserve"> bookstore;</w:t>
       </w:r>
@@ -1430,7 +1095,7 @@
           <w:color w:val="3F3B35"/>
           <w:sz w:val="24"/>
           <w:szCs w:val="24"/>
-          <w:lang/>
+          <w:lang w:val="en-US"/>
         </w:rPr>
       </w:pPr>
     </w:p>
@@ -1461,7 +1126,7 @@
           <w:color w:val="3F3B35"/>
           <w:sz w:val="24"/>
           <w:szCs w:val="24"/>
-          <w:lang/>
+          <w:lang w:val="en-US"/>
         </w:rPr>
       </w:pPr>
       <w:r>
@@ -1472,7 +1137,7 @@
           <w:color w:val="CF222E"/>
           <w:sz w:val="24"/>
           <w:szCs w:val="24"/>
-          <w:lang/>
+          <w:lang w:val="en-US"/>
         </w:rPr>
         <w:t>CREATE</w:t>
       </w:r>
@@ -1482,7 +1147,7 @@
           <w:color w:val="3F3B35"/>
           <w:sz w:val="24"/>
           <w:szCs w:val="24"/>
-          <w:lang/>
+          <w:lang w:val="en-US"/>
         </w:rPr>
         <w:t xml:space="preserve"> </w:t>
       </w:r>
@@ -1494,7 +1159,7 @@
           <w:color w:val="CF222E"/>
           <w:sz w:val="24"/>
           <w:szCs w:val="24"/>
-          <w:lang/>
+          <w:lang w:val="en-US"/>
         </w:rPr>
         <w:t>TABLE</w:t>
       </w:r>
@@ -1504,7 +1169,7 @@
           <w:color w:val="3F3B35"/>
           <w:sz w:val="24"/>
           <w:szCs w:val="24"/>
-          <w:lang/>
+          <w:lang w:val="en-US"/>
         </w:rPr>
         <w:t xml:space="preserve"> books (</w:t>
       </w:r>
@@ -1536,16 +1201,16 @@
           <w:color w:val="3F3B35"/>
           <w:sz w:val="24"/>
           <w:szCs w:val="24"/>
-          <w:lang/>
-        </w:rPr>
-      </w:pPr>
-      <w:r>
-        <w:rPr>
-          <w:rFonts w:asciiTheme="majorBidi" w:eastAsia="Times New Roman" w:hAnsiTheme="majorBidi" w:cstheme="majorBidi"/>
-          <w:color w:val="3F3B35"/>
-          <w:sz w:val="24"/>
-          <w:szCs w:val="24"/>
-          <w:lang/>
+          <w:lang w:val="en-US"/>
+        </w:rPr>
+      </w:pPr>
+      <w:r>
+        <w:rPr>
+          <w:rFonts w:asciiTheme="majorBidi" w:eastAsia="Times New Roman" w:hAnsiTheme="majorBidi" w:cstheme="majorBidi"/>
+          <w:color w:val="3F3B35"/>
+          <w:sz w:val="24"/>
+          <w:szCs w:val="24"/>
+          <w:lang w:val="en-US"/>
         </w:rPr>
         <w:t xml:space="preserve">  </w:t>
       </w:r>
@@ -1556,7 +1221,7 @@
           <w:color w:val="3F3B35"/>
           <w:sz w:val="24"/>
           <w:szCs w:val="24"/>
-          <w:lang/>
+          <w:lang w:val="en-US"/>
         </w:rPr>
         <w:t>id</w:t>
       </w:r>
@@ -1567,7 +1232,7 @@
           <w:color w:val="3F3B35"/>
           <w:sz w:val="24"/>
           <w:szCs w:val="24"/>
-          <w:lang/>
+          <w:lang w:val="en-US"/>
         </w:rPr>
         <w:t xml:space="preserve"> </w:t>
       </w:r>
@@ -1579,7 +1244,7 @@
           <w:color w:val="CF222E"/>
           <w:sz w:val="24"/>
           <w:szCs w:val="24"/>
-          <w:lang/>
+          <w:lang w:val="en-US"/>
         </w:rPr>
         <w:t>INT</w:t>
       </w:r>
@@ -1589,7 +1254,7 @@
           <w:color w:val="3F3B35"/>
           <w:sz w:val="24"/>
           <w:szCs w:val="24"/>
-          <w:lang/>
+          <w:lang w:val="en-US"/>
         </w:rPr>
         <w:t xml:space="preserve"> </w:t>
       </w:r>
@@ -1601,7 +1266,7 @@
           <w:color w:val="CF222E"/>
           <w:sz w:val="24"/>
           <w:szCs w:val="24"/>
-          <w:lang/>
+          <w:lang w:val="en-US"/>
         </w:rPr>
         <w:t>AUTO_INCREMENT</w:t>
       </w:r>
@@ -1611,7 +1276,7 @@
           <w:color w:val="3F3B35"/>
           <w:sz w:val="24"/>
           <w:szCs w:val="24"/>
-          <w:lang/>
+          <w:lang w:val="en-US"/>
         </w:rPr>
         <w:t xml:space="preserve"> </w:t>
       </w:r>
@@ -1623,7 +1288,7 @@
           <w:color w:val="CF222E"/>
           <w:sz w:val="24"/>
           <w:szCs w:val="24"/>
-          <w:lang/>
+          <w:lang w:val="en-US"/>
         </w:rPr>
         <w:t>PRIMARY</w:t>
       </w:r>
@@ -1633,7 +1298,7 @@
           <w:color w:val="3F3B35"/>
           <w:sz w:val="24"/>
           <w:szCs w:val="24"/>
-          <w:lang/>
+          <w:lang w:val="en-US"/>
         </w:rPr>
         <w:t xml:space="preserve"> </w:t>
       </w:r>
@@ -1645,7 +1310,7 @@
           <w:color w:val="CF222E"/>
           <w:sz w:val="24"/>
           <w:szCs w:val="24"/>
-          <w:lang/>
+          <w:lang w:val="en-US"/>
         </w:rPr>
         <w:t>KEY</w:t>
       </w:r>
@@ -1655,7 +1320,7 @@
           <w:color w:val="3F3B35"/>
           <w:sz w:val="24"/>
           <w:szCs w:val="24"/>
-          <w:lang/>
+          <w:lang w:val="en-US"/>
         </w:rPr>
         <w:t>,</w:t>
       </w:r>
@@ -1687,16 +1352,16 @@
           <w:color w:val="3F3B35"/>
           <w:sz w:val="24"/>
           <w:szCs w:val="24"/>
-          <w:lang/>
-        </w:rPr>
-      </w:pPr>
-      <w:r>
-        <w:rPr>
-          <w:rFonts w:asciiTheme="majorBidi" w:eastAsia="Times New Roman" w:hAnsiTheme="majorBidi" w:cstheme="majorBidi"/>
-          <w:color w:val="3F3B35"/>
-          <w:sz w:val="24"/>
-          <w:szCs w:val="24"/>
-          <w:lang/>
+          <w:lang w:val="en-US"/>
+        </w:rPr>
+      </w:pPr>
+      <w:r>
+        <w:rPr>
+          <w:rFonts w:asciiTheme="majorBidi" w:eastAsia="Times New Roman" w:hAnsiTheme="majorBidi" w:cstheme="majorBidi"/>
+          <w:color w:val="3F3B35"/>
+          <w:sz w:val="24"/>
+          <w:szCs w:val="24"/>
+          <w:lang w:val="en-US"/>
         </w:rPr>
         <w:t xml:space="preserve">  </w:t>
       </w:r>
@@ -1707,7 +1372,7 @@
           <w:color w:val="3F3B35"/>
           <w:sz w:val="24"/>
           <w:szCs w:val="24"/>
-          <w:lang/>
+          <w:lang w:val="en-US"/>
         </w:rPr>
         <w:t>title</w:t>
       </w:r>
@@ -1718,7 +1383,7 @@
           <w:color w:val="3F3B35"/>
           <w:sz w:val="24"/>
           <w:szCs w:val="24"/>
-          <w:lang/>
+          <w:lang w:val="en-US"/>
         </w:rPr>
         <w:t xml:space="preserve"> </w:t>
       </w:r>
@@ -1730,7 +1395,7 @@
           <w:color w:val="CF222E"/>
           <w:sz w:val="24"/>
           <w:szCs w:val="24"/>
-          <w:lang/>
+          <w:lang w:val="en-US"/>
         </w:rPr>
         <w:t>VARCHAR</w:t>
       </w:r>
@@ -1740,7 +1405,7 @@
           <w:color w:val="3F3B35"/>
           <w:sz w:val="24"/>
           <w:szCs w:val="24"/>
-          <w:lang/>
+          <w:lang w:val="en-US"/>
         </w:rPr>
         <w:t>(</w:t>
       </w:r>
@@ -1750,7 +1415,7 @@
           <w:color w:val="0550AE"/>
           <w:sz w:val="24"/>
           <w:szCs w:val="24"/>
-          <w:lang/>
+          <w:lang w:val="en-US"/>
         </w:rPr>
         <w:t>100</w:t>
       </w:r>
@@ -1760,7 +1425,7 @@
           <w:color w:val="3F3B35"/>
           <w:sz w:val="24"/>
           <w:szCs w:val="24"/>
-          <w:lang/>
+          <w:lang w:val="en-US"/>
         </w:rPr>
         <w:t>),</w:t>
       </w:r>
@@ -1792,16 +1457,16 @@
           <w:color w:val="3F3B35"/>
           <w:sz w:val="24"/>
           <w:szCs w:val="24"/>
-          <w:lang/>
-        </w:rPr>
-      </w:pPr>
-      <w:r>
-        <w:rPr>
-          <w:rFonts w:asciiTheme="majorBidi" w:eastAsia="Times New Roman" w:hAnsiTheme="majorBidi" w:cstheme="majorBidi"/>
-          <w:color w:val="3F3B35"/>
-          <w:sz w:val="24"/>
-          <w:szCs w:val="24"/>
-          <w:lang/>
+          <w:lang w:val="en-US"/>
+        </w:rPr>
+      </w:pPr>
+      <w:r>
+        <w:rPr>
+          <w:rFonts w:asciiTheme="majorBidi" w:eastAsia="Times New Roman" w:hAnsiTheme="majorBidi" w:cstheme="majorBidi"/>
+          <w:color w:val="3F3B35"/>
+          <w:sz w:val="24"/>
+          <w:szCs w:val="24"/>
+          <w:lang w:val="en-US"/>
         </w:rPr>
         <w:t xml:space="preserve">  </w:t>
       </w:r>
@@ -1812,7 +1477,7 @@
           <w:color w:val="3F3B35"/>
           <w:sz w:val="24"/>
           <w:szCs w:val="24"/>
-          <w:lang/>
+          <w:lang w:val="en-US"/>
         </w:rPr>
         <w:t>author</w:t>
       </w:r>
@@ -1823,7 +1488,7 @@
           <w:color w:val="3F3B35"/>
           <w:sz w:val="24"/>
           <w:szCs w:val="24"/>
-          <w:lang/>
+          <w:lang w:val="en-US"/>
         </w:rPr>
         <w:t xml:space="preserve"> </w:t>
       </w:r>
@@ -1835,7 +1500,7 @@
           <w:color w:val="CF222E"/>
           <w:sz w:val="24"/>
           <w:szCs w:val="24"/>
-          <w:lang/>
+          <w:lang w:val="en-US"/>
         </w:rPr>
         <w:t>VARCHAR</w:t>
       </w:r>
@@ -1845,7 +1510,7 @@
           <w:color w:val="3F3B35"/>
           <w:sz w:val="24"/>
           <w:szCs w:val="24"/>
-          <w:lang/>
+          <w:lang w:val="en-US"/>
         </w:rPr>
         <w:t>(</w:t>
       </w:r>
@@ -1855,7 +1520,7 @@
           <w:color w:val="0550AE"/>
           <w:sz w:val="24"/>
           <w:szCs w:val="24"/>
-          <w:lang/>
+          <w:lang w:val="en-US"/>
         </w:rPr>
         <w:t>100</w:t>
       </w:r>
@@ -1865,7 +1530,7 @@
           <w:color w:val="3F3B35"/>
           <w:sz w:val="24"/>
           <w:szCs w:val="24"/>
-          <w:lang/>
+          <w:lang w:val="en-US"/>
         </w:rPr>
         <w:t>)</w:t>
       </w:r>
@@ -1897,16 +1562,16 @@
           <w:color w:val="3F3B35"/>
           <w:sz w:val="24"/>
           <w:szCs w:val="24"/>
-          <w:lang/>
-        </w:rPr>
-      </w:pPr>
-      <w:r>
-        <w:rPr>
-          <w:rFonts w:asciiTheme="majorBidi" w:eastAsia="Times New Roman" w:hAnsiTheme="majorBidi" w:cstheme="majorBidi"/>
-          <w:color w:val="3F3B35"/>
-          <w:sz w:val="24"/>
-          <w:szCs w:val="24"/>
-          <w:lang/>
+          <w:lang w:val="en-US"/>
+        </w:rPr>
+      </w:pPr>
+      <w:r>
+        <w:rPr>
+          <w:rFonts w:asciiTheme="majorBidi" w:eastAsia="Times New Roman" w:hAnsiTheme="majorBidi" w:cstheme="majorBidi"/>
+          <w:color w:val="3F3B35"/>
+          <w:sz w:val="24"/>
+          <w:szCs w:val="24"/>
+          <w:lang w:val="en-US"/>
         </w:rPr>
         <w:t>);</w:t>
       </w:r>
@@ -1938,7 +1603,7 @@
           <w:color w:val="3F3B35"/>
           <w:sz w:val="24"/>
           <w:szCs w:val="24"/>
-          <w:lang/>
+          <w:lang w:val="en-US"/>
         </w:rPr>
       </w:pPr>
     </w:p>
@@ -1969,7 +1634,7 @@
           <w:color w:val="3F3B35"/>
           <w:sz w:val="24"/>
           <w:szCs w:val="24"/>
-          <w:lang/>
+          <w:lang w:val="en-US"/>
         </w:rPr>
       </w:pPr>
       <w:r>
@@ -1980,7 +1645,7 @@
           <w:color w:val="CF222E"/>
           <w:sz w:val="24"/>
           <w:szCs w:val="24"/>
-          <w:lang/>
+          <w:lang w:val="en-US"/>
         </w:rPr>
         <w:t>SHOW</w:t>
       </w:r>
@@ -1990,7 +1655,7 @@
           <w:color w:val="3F3B35"/>
           <w:sz w:val="24"/>
           <w:szCs w:val="24"/>
-          <w:lang/>
+          <w:lang w:val="en-US"/>
         </w:rPr>
         <w:t xml:space="preserve"> </w:t>
       </w:r>
@@ -2002,7 +1667,7 @@
           <w:color w:val="CF222E"/>
           <w:sz w:val="24"/>
           <w:szCs w:val="24"/>
-          <w:lang/>
+          <w:lang w:val="en-US"/>
         </w:rPr>
         <w:t>CREATE</w:t>
       </w:r>
@@ -2012,7 +1677,7 @@
           <w:color w:val="3F3B35"/>
           <w:sz w:val="24"/>
           <w:szCs w:val="24"/>
-          <w:lang/>
+          <w:lang w:val="en-US"/>
         </w:rPr>
         <w:t xml:space="preserve"> </w:t>
       </w:r>
@@ -2024,7 +1689,7 @@
           <w:color w:val="CF222E"/>
           <w:sz w:val="24"/>
           <w:szCs w:val="24"/>
-          <w:lang/>
+          <w:lang w:val="en-US"/>
         </w:rPr>
         <w:t>TABLE</w:t>
       </w:r>
@@ -2034,7 +1699,7 @@
           <w:color w:val="3F3B35"/>
           <w:sz w:val="24"/>
           <w:szCs w:val="24"/>
-          <w:lang/>
+          <w:lang w:val="en-US"/>
         </w:rPr>
         <w:t xml:space="preserve"> books;</w:t>
       </w:r>
@@ -2066,7 +1731,7 @@
           <w:color w:val="3F3B35"/>
           <w:sz w:val="24"/>
           <w:szCs w:val="24"/>
-          <w:lang/>
+          <w:lang w:val="en-US"/>
         </w:rPr>
       </w:pPr>
     </w:p>
@@ -2097,7 +1762,7 @@
           <w:color w:val="3F3B35"/>
           <w:sz w:val="24"/>
           <w:szCs w:val="24"/>
-          <w:lang/>
+          <w:lang w:val="en-US"/>
         </w:rPr>
       </w:pPr>
       <w:r>
@@ -2108,7 +1773,7 @@
           <w:color w:val="CF222E"/>
           <w:sz w:val="24"/>
           <w:szCs w:val="24"/>
-          <w:lang/>
+          <w:lang w:val="en-US"/>
         </w:rPr>
         <w:t>INSERT</w:t>
       </w:r>
@@ -2118,7 +1783,7 @@
           <w:color w:val="3F3B35"/>
           <w:sz w:val="24"/>
           <w:szCs w:val="24"/>
-          <w:lang/>
+          <w:lang w:val="en-US"/>
         </w:rPr>
         <w:t xml:space="preserve"> </w:t>
       </w:r>
@@ -2130,7 +1795,7 @@
           <w:color w:val="CF222E"/>
           <w:sz w:val="24"/>
           <w:szCs w:val="24"/>
-          <w:lang/>
+          <w:lang w:val="en-US"/>
         </w:rPr>
         <w:t>INTO</w:t>
       </w:r>
@@ -2140,7 +1805,7 @@
           <w:color w:val="3F3B35"/>
           <w:sz w:val="24"/>
           <w:szCs w:val="24"/>
-          <w:lang/>
+          <w:lang w:val="en-US"/>
         </w:rPr>
         <w:t xml:space="preserve"> books (title, author)</w:t>
       </w:r>
@@ -2172,7 +1837,7 @@
           <w:color w:val="3F3B35"/>
           <w:sz w:val="24"/>
           <w:szCs w:val="24"/>
-          <w:lang/>
+          <w:lang w:val="en-US"/>
         </w:rPr>
       </w:pPr>
       <w:r>
@@ -2183,7 +1848,7 @@
           <w:color w:val="CF222E"/>
           <w:sz w:val="24"/>
           <w:szCs w:val="24"/>
-          <w:lang/>
+          <w:lang w:val="en-US"/>
         </w:rPr>
         <w:t>VALUES</w:t>
       </w:r>
@@ -2193,7 +1858,7 @@
           <w:color w:val="3F3B35"/>
           <w:sz w:val="24"/>
           <w:szCs w:val="24"/>
-          <w:lang/>
+          <w:lang w:val="en-US"/>
         </w:rPr>
         <w:t xml:space="preserve"> (</w:t>
       </w:r>
@@ -2203,7 +1868,7 @@
           <w:color w:val="0A3069"/>
           <w:sz w:val="24"/>
           <w:szCs w:val="24"/>
-          <w:lang/>
+          <w:lang w:val="en-US"/>
         </w:rPr>
         <w:t>'Clean Code'</w:t>
       </w:r>
@@ -2213,7 +1878,7 @@
           <w:color w:val="3F3B35"/>
           <w:sz w:val="24"/>
           <w:szCs w:val="24"/>
-          <w:lang/>
+          <w:lang w:val="en-US"/>
         </w:rPr>
         <w:t xml:space="preserve">, </w:t>
       </w:r>
@@ -2223,7 +1888,7 @@
           <w:color w:val="0A3069"/>
           <w:sz w:val="24"/>
           <w:szCs w:val="24"/>
-          <w:lang/>
+          <w:lang w:val="en-US"/>
         </w:rPr>
         <w:t>'Robert C. Martin'</w:t>
       </w:r>
@@ -2233,7 +1898,7 @@
           <w:color w:val="3F3B35"/>
           <w:sz w:val="24"/>
           <w:szCs w:val="24"/>
-          <w:lang/>
+          <w:lang w:val="en-US"/>
         </w:rPr>
         <w:t>);</w:t>
       </w:r>
@@ -2265,7 +1930,7 @@
           <w:color w:val="3F3B35"/>
           <w:sz w:val="24"/>
           <w:szCs w:val="24"/>
-          <w:lang/>
+          <w:lang w:val="en-US"/>
         </w:rPr>
       </w:pPr>
     </w:p>
@@ -2296,7 +1961,7 @@
           <w:color w:val="3F3B35"/>
           <w:sz w:val="24"/>
           <w:szCs w:val="24"/>
-          <w:lang/>
+          <w:lang w:val="en-US"/>
         </w:rPr>
       </w:pPr>
       <w:r>
@@ -2307,7 +1972,7 @@
           <w:color w:val="CF222E"/>
           <w:sz w:val="24"/>
           <w:szCs w:val="24"/>
-          <w:lang/>
+          <w:lang w:val="en-US"/>
         </w:rPr>
         <w:t>SELECT</w:t>
       </w:r>
@@ -2317,7 +1982,7 @@
           <w:color w:val="3F3B35"/>
           <w:sz w:val="24"/>
           <w:szCs w:val="24"/>
-          <w:lang/>
+          <w:lang w:val="en-US"/>
         </w:rPr>
         <w:t xml:space="preserve"> * </w:t>
       </w:r>
@@ -2329,7 +1994,7 @@
           <w:color w:val="CF222E"/>
           <w:sz w:val="24"/>
           <w:szCs w:val="24"/>
-          <w:lang/>
+          <w:lang w:val="en-US"/>
         </w:rPr>
         <w:t>FROM</w:t>
       </w:r>
@@ -2339,7 +2004,7 @@
           <w:color w:val="3F3B35"/>
           <w:sz w:val="24"/>
           <w:szCs w:val="24"/>
-          <w:lang/>
+          <w:lang w:val="en-US"/>
         </w:rPr>
         <w:t xml:space="preserve"> books;</w:t>
       </w:r>
@@ -2371,7 +2036,7 @@
           <w:color w:val="3F3B35"/>
           <w:sz w:val="24"/>
           <w:szCs w:val="24"/>
-          <w:lang/>
+          <w:lang w:val="en-US"/>
         </w:rPr>
       </w:pPr>
     </w:p>
@@ -2402,7 +2067,7 @@
           <w:color w:val="3F3B35"/>
           <w:sz w:val="24"/>
           <w:szCs w:val="24"/>
-          <w:lang/>
+          <w:lang w:val="en-US"/>
         </w:rPr>
       </w:pPr>
       <w:r>
@@ -2413,7 +2078,7 @@
           <w:color w:val="CF222E"/>
           <w:sz w:val="24"/>
           <w:szCs w:val="24"/>
-          <w:lang/>
+          <w:lang w:val="en-US"/>
         </w:rPr>
         <w:t>DROP</w:t>
       </w:r>
@@ -2423,7 +2088,7 @@
           <w:color w:val="3F3B35"/>
           <w:sz w:val="24"/>
           <w:szCs w:val="24"/>
-          <w:lang/>
+          <w:lang w:val="en-US"/>
         </w:rPr>
         <w:t xml:space="preserve"> </w:t>
       </w:r>
@@ -2435,7 +2100,7 @@
           <w:color w:val="CF222E"/>
           <w:sz w:val="24"/>
           <w:szCs w:val="24"/>
-          <w:lang/>
+          <w:lang w:val="en-US"/>
         </w:rPr>
         <w:t>TABLE</w:t>
       </w:r>
@@ -2445,7 +2110,7 @@
           <w:color w:val="3F3B35"/>
           <w:sz w:val="24"/>
           <w:szCs w:val="24"/>
-          <w:lang/>
+          <w:lang w:val="en-US"/>
         </w:rPr>
         <w:t xml:space="preserve"> books;</w:t>
       </w:r>
@@ -2477,7 +2142,7 @@
           <w:color w:val="D6D5D4"/>
           <w:sz w:val="24"/>
           <w:szCs w:val="24"/>
-          <w:lang/>
+          <w:lang w:val="en-US"/>
         </w:rPr>
       </w:pPr>
       <w:r>
@@ -2488,7 +2153,7 @@
           <w:color w:val="CF222E"/>
           <w:sz w:val="24"/>
           <w:szCs w:val="24"/>
-          <w:lang/>
+          <w:lang w:val="en-US"/>
         </w:rPr>
         <w:t>DROP</w:t>
       </w:r>
@@ -2498,7 +2163,7 @@
           <w:color w:val="3F3B35"/>
           <w:sz w:val="24"/>
           <w:szCs w:val="24"/>
-          <w:lang/>
+          <w:lang w:val="en-US"/>
         </w:rPr>
         <w:t xml:space="preserve"> </w:t>
       </w:r>
@@ -2510,7 +2175,7 @@
           <w:color w:val="CF222E"/>
           <w:sz w:val="24"/>
           <w:szCs w:val="24"/>
-          <w:lang/>
+          <w:lang w:val="en-US"/>
         </w:rPr>
         <w:t>DATABASE</w:t>
       </w:r>
@@ -2520,7 +2185,7 @@
           <w:color w:val="3F3B35"/>
           <w:sz w:val="24"/>
           <w:szCs w:val="24"/>
-          <w:lang/>
+          <w:lang w:val="en-US"/>
         </w:rPr>
         <w:t xml:space="preserve"> bookstore;</w:t>
       </w:r>
@@ -2534,41 +2199,19 @@
           <w:color w:val="27251E"/>
           <w:sz w:val="24"/>
           <w:szCs w:val="24"/>
-          <w:lang/>
-        </w:rPr>
-      </w:pPr>
-      <w:r>
-        <w:rPr>
-          <w:rFonts w:asciiTheme="majorBidi" w:eastAsia="Times New Roman" w:hAnsiTheme="majorBidi" w:cstheme="majorBidi"/>
-          <w:color w:val="27251E"/>
-          <w:sz w:val="24"/>
-          <w:szCs w:val="24"/>
-          <w:lang/>
+          <w:lang w:val="en-US"/>
+        </w:rPr>
+      </w:pPr>
+      <w:r>
+        <w:rPr>
+          <w:rFonts w:asciiTheme="majorBidi" w:eastAsia="Times New Roman" w:hAnsiTheme="majorBidi" w:cstheme="majorBidi"/>
+          <w:color w:val="27251E"/>
+          <w:sz w:val="24"/>
+          <w:szCs w:val="24"/>
+          <w:lang w:val="en-US"/>
         </w:rPr>
         <w:lastRenderedPageBreak/>
-        <w:t xml:space="preserve">SHOW CREATE TABLE displays the SQL statement used to create a table. INSERT adds data, SELECT reads data, and DROP removes tables or databases, so together they form a simple cheat sheet for basic </w:t>
-      </w:r>
-      <w:proofErr w:type="spellStart"/>
-      <w:r>
-        <w:rPr>
-          <w:rFonts w:asciiTheme="majorBidi" w:eastAsia="Times New Roman" w:hAnsiTheme="majorBidi" w:cstheme="majorBidi"/>
-          <w:color w:val="27251E"/>
-          <w:sz w:val="24"/>
-          <w:szCs w:val="24"/>
-          <w:lang/>
-        </w:rPr>
-        <w:t>MySQL</w:t>
-      </w:r>
-      <w:proofErr w:type="spellEnd"/>
-      <w:r>
-        <w:rPr>
-          <w:rFonts w:asciiTheme="majorBidi" w:eastAsia="Times New Roman" w:hAnsiTheme="majorBidi" w:cstheme="majorBidi"/>
-          <w:color w:val="27251E"/>
-          <w:sz w:val="24"/>
-          <w:szCs w:val="24"/>
-          <w:lang/>
-        </w:rPr>
-        <w:t xml:space="preserve"> operations.</w:t>
+        <w:t>SHOW CREATE TABLE displays the SQL statement used to create a table. INSERT adds data, SELECT reads data, and DROP removes tables or databases, so together they form a simple cheat sheet for basic MySQL operations.</w:t>
       </w:r>
     </w:p>
     <w:p>
@@ -2583,18 +2226,18 @@
           <w:color w:val="27251E"/>
           <w:sz w:val="24"/>
           <w:szCs w:val="24"/>
-          <w:lang/>
-        </w:rPr>
-      </w:pPr>
-      <w:r>
-        <w:rPr>
-          <w:rFonts w:asciiTheme="majorBidi" w:eastAsia="Times New Roman" w:hAnsiTheme="majorBidi" w:cstheme="majorBidi"/>
-          <w:b/>
-          <w:bCs/>
-          <w:color w:val="27251E"/>
-          <w:sz w:val="24"/>
-          <w:szCs w:val="24"/>
-          <w:lang/>
+          <w:lang w:val="en-US"/>
+        </w:rPr>
+      </w:pPr>
+      <w:r>
+        <w:rPr>
+          <w:rFonts w:asciiTheme="majorBidi" w:eastAsia="Times New Roman" w:hAnsiTheme="majorBidi" w:cstheme="majorBidi"/>
+          <w:b/>
+          <w:bCs/>
+          <w:color w:val="27251E"/>
+          <w:sz w:val="24"/>
+          <w:szCs w:val="24"/>
+          <w:lang w:val="en-US"/>
         </w:rPr>
         <w:t>6. Troubleshooting tools</w:t>
       </w:r>
@@ -2608,16 +2251,16 @@
           <w:color w:val="27251E"/>
           <w:sz w:val="24"/>
           <w:szCs w:val="24"/>
-          <w:lang/>
-        </w:rPr>
-      </w:pPr>
-      <w:r>
-        <w:rPr>
-          <w:rFonts w:asciiTheme="majorBidi" w:eastAsia="Times New Roman" w:hAnsiTheme="majorBidi" w:cstheme="majorBidi"/>
-          <w:color w:val="27251E"/>
-          <w:sz w:val="24"/>
-          <w:szCs w:val="24"/>
-          <w:lang/>
+          <w:lang w:val="en-US"/>
+        </w:rPr>
+      </w:pPr>
+      <w:r>
+        <w:rPr>
+          <w:rFonts w:asciiTheme="majorBidi" w:eastAsia="Times New Roman" w:hAnsiTheme="majorBidi" w:cstheme="majorBidi"/>
+          <w:color w:val="27251E"/>
+          <w:sz w:val="24"/>
+          <w:szCs w:val="24"/>
+          <w:lang w:val="en-US"/>
         </w:rPr>
         <w:t>When client–server communication fails, it helps to diagnose the problem from the network layer up to the application layer.</w:t>
       </w:r>
@@ -2636,7 +2279,7 @@
           <w:color w:val="27251E"/>
           <w:sz w:val="24"/>
           <w:szCs w:val="24"/>
-          <w:lang/>
+          <w:lang w:val="en-US"/>
         </w:rPr>
       </w:pPr>
       <w:proofErr w:type="gramStart"/>
@@ -2648,7 +2291,7 @@
           <w:color w:val="27251E"/>
           <w:sz w:val="24"/>
           <w:szCs w:val="24"/>
-          <w:lang/>
+          <w:lang w:val="en-US"/>
         </w:rPr>
         <w:t>ping</w:t>
       </w:r>
@@ -2659,7 +2302,7 @@
           <w:color w:val="27251E"/>
           <w:sz w:val="24"/>
           <w:szCs w:val="24"/>
-          <w:lang/>
+          <w:lang w:val="en-US"/>
         </w:rPr>
         <w:t> checks whether a host is reachable and gives simple latency and packet-loss information.</w:t>
       </w:r>
@@ -2678,10 +2321,9 @@
           <w:color w:val="27251E"/>
           <w:sz w:val="24"/>
           <w:szCs w:val="24"/>
-          <w:lang/>
-        </w:rPr>
-      </w:pPr>
-      <w:proofErr w:type="spellStart"/>
+          <w:lang w:val="en-US"/>
+        </w:rPr>
+      </w:pPr>
       <w:proofErr w:type="gramStart"/>
       <w:r>
         <w:rPr>
@@ -2691,11 +2333,10 @@
           <w:color w:val="27251E"/>
           <w:sz w:val="24"/>
           <w:szCs w:val="24"/>
-          <w:lang/>
+          <w:lang w:val="en-US"/>
         </w:rPr>
         <w:t>traceroute</w:t>
       </w:r>
-      <w:proofErr w:type="spellEnd"/>
       <w:proofErr w:type="gramEnd"/>
       <w:r>
         <w:rPr>
@@ -2703,7 +2344,7 @@
           <w:color w:val="27251E"/>
           <w:sz w:val="24"/>
           <w:szCs w:val="24"/>
-          <w:lang/>
+          <w:lang w:val="en-US"/>
         </w:rPr>
         <w:t> shows the path packets take through the network and helps locate where delays or failures happen.</w:t>
       </w:r>
@@ -2722,7 +2363,7 @@
           <w:color w:val="27251E"/>
           <w:sz w:val="24"/>
           <w:szCs w:val="24"/>
-          <w:lang/>
+          <w:lang w:val="en-US"/>
         </w:rPr>
       </w:pPr>
       <w:proofErr w:type="gramStart"/>
@@ -2734,7 +2375,7 @@
           <w:color w:val="27251E"/>
           <w:sz w:val="24"/>
           <w:szCs w:val="24"/>
-          <w:lang/>
+          <w:lang w:val="en-US"/>
         </w:rPr>
         <w:t>curl</w:t>
       </w:r>
@@ -2747,31 +2388,17 @@
           <w:color w:val="27251E"/>
           <w:sz w:val="24"/>
           <w:szCs w:val="24"/>
-          <w:lang/>
-        </w:rPr>
-        <w:t xml:space="preserve"> -</w:t>
-      </w:r>
-      <w:proofErr w:type="spellStart"/>
-      <w:r>
-        <w:rPr>
-          <w:rFonts w:asciiTheme="majorBidi" w:eastAsia="Times New Roman" w:hAnsiTheme="majorBidi" w:cstheme="majorBidi"/>
-          <w:b/>
-          <w:bCs/>
-          <w:color w:val="27251E"/>
-          <w:sz w:val="24"/>
-          <w:szCs w:val="24"/>
-          <w:lang/>
-        </w:rPr>
-        <w:t>lv</w:t>
-      </w:r>
-      <w:proofErr w:type="spellEnd"/>
-      <w:r>
-        <w:rPr>
-          <w:rFonts w:asciiTheme="majorBidi" w:eastAsia="Times New Roman" w:hAnsiTheme="majorBidi" w:cstheme="majorBidi"/>
-          <w:color w:val="27251E"/>
-          <w:sz w:val="24"/>
-          <w:szCs w:val="24"/>
-          <w:lang/>
+          <w:lang w:val="en-US"/>
+        </w:rPr>
+        <w:t xml:space="preserve"> -lv</w:t>
+      </w:r>
+      <w:r>
+        <w:rPr>
+          <w:rFonts w:asciiTheme="majorBidi" w:eastAsia="Times New Roman" w:hAnsiTheme="majorBidi" w:cstheme="majorBidi"/>
+          <w:color w:val="27251E"/>
+          <w:sz w:val="24"/>
+          <w:szCs w:val="24"/>
+          <w:lang w:val="en-US"/>
         </w:rPr>
         <w:t> checks whether an HTTP service is reachable and responding correctly.</w:t>
       </w:r>
@@ -2785,16 +2412,14 @@
           <w:color w:val="27251E"/>
           <w:sz w:val="24"/>
           <w:szCs w:val="24"/>
-          <w:lang/>
-        </w:rPr>
-      </w:pPr>
-      <w:r>
-        <w:rPr>
-          <w:rFonts w:asciiTheme="majorBidi" w:eastAsia="Times New Roman" w:hAnsiTheme="majorBidi" w:cstheme="majorBidi"/>
-          <w:color w:val="27251E"/>
-          <w:sz w:val="24"/>
-          <w:szCs w:val="24"/>
-          <w:lang/>
+        </w:rPr>
+      </w:pPr>
+      <w:r>
+        <w:rPr>
+          <w:rFonts w:asciiTheme="majorBidi" w:eastAsia="Times New Roman" w:hAnsiTheme="majorBidi" w:cstheme="majorBidi"/>
+          <w:color w:val="27251E"/>
+          <w:sz w:val="24"/>
+          <w:szCs w:val="24"/>
         </w:rPr>
         <w:t>Examples:</w:t>
       </w:r>
@@ -2826,7 +2451,7 @@
           <w:color w:val="D6D5D4"/>
           <w:sz w:val="24"/>
           <w:szCs w:val="24"/>
-          <w:lang/>
+          <w:lang w:val="en-US"/>
         </w:rPr>
       </w:pPr>
       <w:proofErr w:type="gramStart"/>
@@ -2836,7 +2461,7 @@
           <w:color w:val="D6D5D4"/>
           <w:sz w:val="24"/>
           <w:szCs w:val="24"/>
-          <w:lang/>
+          <w:lang w:val="en-US"/>
         </w:rPr>
         <w:t>bash</w:t>
       </w:r>
@@ -2869,7 +2494,7 @@
           <w:color w:val="3F3B35"/>
           <w:sz w:val="24"/>
           <w:szCs w:val="24"/>
-          <w:lang/>
+          <w:lang w:val="en-US"/>
         </w:rPr>
       </w:pPr>
       <w:proofErr w:type="gramStart"/>
@@ -2879,7 +2504,7 @@
           <w:color w:val="953800"/>
           <w:sz w:val="24"/>
           <w:szCs w:val="24"/>
-          <w:lang/>
+          <w:lang w:val="en-US"/>
         </w:rPr>
         <w:t>ping</w:t>
       </w:r>
@@ -2890,7 +2515,7 @@
           <w:color w:val="3F3B35"/>
           <w:sz w:val="24"/>
           <w:szCs w:val="24"/>
-          <w:lang/>
+          <w:lang w:val="en-US"/>
         </w:rPr>
         <w:t xml:space="preserve"> example.com</w:t>
       </w:r>
@@ -2922,10 +2547,9 @@
           <w:color w:val="3F3B35"/>
           <w:sz w:val="24"/>
           <w:szCs w:val="24"/>
-          <w:lang/>
-        </w:rPr>
-      </w:pPr>
-      <w:proofErr w:type="spellStart"/>
+          <w:lang w:val="en-US"/>
+        </w:rPr>
+      </w:pPr>
       <w:proofErr w:type="gramStart"/>
       <w:r>
         <w:rPr>
@@ -2933,11 +2557,10 @@
           <w:color w:val="953800"/>
           <w:sz w:val="24"/>
           <w:szCs w:val="24"/>
-          <w:lang/>
+          <w:lang w:val="en-US"/>
         </w:rPr>
         <w:t>traceroute</w:t>
       </w:r>
-      <w:proofErr w:type="spellEnd"/>
       <w:proofErr w:type="gramEnd"/>
       <w:r>
         <w:rPr>
@@ -2945,7 +2568,7 @@
           <w:color w:val="3F3B35"/>
           <w:sz w:val="24"/>
           <w:szCs w:val="24"/>
-          <w:lang/>
+          <w:lang w:val="en-US"/>
         </w:rPr>
         <w:t xml:space="preserve"> example.com</w:t>
       </w:r>
@@ -2977,7 +2600,7 @@
           <w:color w:val="D6D5D4"/>
           <w:sz w:val="24"/>
           <w:szCs w:val="24"/>
-          <w:lang/>
+          <w:lang w:val="en-US"/>
         </w:rPr>
       </w:pPr>
       <w:proofErr w:type="gramStart"/>
@@ -2987,7 +2610,7 @@
           <w:color w:val="953800"/>
           <w:sz w:val="24"/>
           <w:szCs w:val="24"/>
-          <w:lang/>
+          <w:lang w:val="en-US"/>
         </w:rPr>
         <w:t>curl</w:t>
       </w:r>
@@ -2998,52 +2621,30 @@
           <w:color w:val="3F3B35"/>
           <w:sz w:val="24"/>
           <w:szCs w:val="24"/>
-          <w:lang/>
-        </w:rPr>
-        <w:t xml:space="preserve"> -</w:t>
-      </w:r>
-      <w:proofErr w:type="spellStart"/>
-      <w:r>
-        <w:rPr>
-          <w:rFonts w:asciiTheme="majorBidi" w:eastAsia="Times New Roman" w:hAnsiTheme="majorBidi" w:cstheme="majorBidi"/>
-          <w:color w:val="3F3B35"/>
-          <w:sz w:val="24"/>
-          <w:szCs w:val="24"/>
-          <w:lang/>
-        </w:rPr>
-        <w:t>lv</w:t>
-      </w:r>
-      <w:proofErr w:type="spellEnd"/>
-      <w:r>
-        <w:rPr>
-          <w:rFonts w:asciiTheme="majorBidi" w:eastAsia="Times New Roman" w:hAnsiTheme="majorBidi" w:cstheme="majorBidi"/>
-          <w:color w:val="3F3B35"/>
-          <w:sz w:val="24"/>
-          <w:szCs w:val="24"/>
-          <w:lang/>
-        </w:rPr>
-        <w:t xml:space="preserve"> https://example.com</w:t>
-      </w:r>
-    </w:p>
-    <w:p>
-      <w:pPr>
-        <w:spacing w:before="100" w:beforeAutospacing="1" w:after="100" w:afterAutospacing="1" w:line="360" w:lineRule="auto"/>
-        <w:contextualSpacing/>
-        <w:rPr>
-          <w:rFonts w:asciiTheme="majorBidi" w:eastAsia="Times New Roman" w:hAnsiTheme="majorBidi" w:cstheme="majorBidi"/>
-          <w:color w:val="27251E"/>
-          <w:sz w:val="24"/>
-          <w:szCs w:val="24"/>
-          <w:lang/>
-        </w:rPr>
-      </w:pPr>
-      <w:r>
-        <w:rPr>
-          <w:rFonts w:asciiTheme="majorBidi" w:eastAsia="Times New Roman" w:hAnsiTheme="majorBidi" w:cstheme="majorBidi"/>
-          <w:color w:val="27251E"/>
-          <w:sz w:val="24"/>
-          <w:szCs w:val="24"/>
-          <w:lang/>
+          <w:lang w:val="en-US"/>
+        </w:rPr>
+        <w:t xml:space="preserve"> -lv https://example.com</w:t>
+      </w:r>
+    </w:p>
+    <w:p>
+      <w:pPr>
+        <w:spacing w:before="100" w:beforeAutospacing="1" w:after="100" w:afterAutospacing="1" w:line="360" w:lineRule="auto"/>
+        <w:contextualSpacing/>
+        <w:rPr>
+          <w:rFonts w:asciiTheme="majorBidi" w:eastAsia="Times New Roman" w:hAnsiTheme="majorBidi" w:cstheme="majorBidi"/>
+          <w:color w:val="27251E"/>
+          <w:sz w:val="24"/>
+          <w:szCs w:val="24"/>
+          <w:lang w:val="en-US"/>
+        </w:rPr>
+      </w:pPr>
+      <w:r>
+        <w:rPr>
+          <w:rFonts w:asciiTheme="majorBidi" w:eastAsia="Times New Roman" w:hAnsiTheme="majorBidi" w:cstheme="majorBidi"/>
+          <w:color w:val="27251E"/>
+          <w:sz w:val="24"/>
+          <w:szCs w:val="24"/>
+          <w:lang w:val="en-US"/>
         </w:rPr>
         <w:t>These tools answer different questions: whether the host is reachable, where network traffic is getting delayed, and whether the server application itself is responding.</w:t>
       </w:r>
@@ -3060,91 +2661,51 @@
           <w:color w:val="27251E"/>
           <w:sz w:val="24"/>
           <w:szCs w:val="24"/>
-          <w:lang/>
-        </w:rPr>
-      </w:pPr>
-      <w:r>
-        <w:rPr>
-          <w:rFonts w:asciiTheme="majorBidi" w:eastAsia="Times New Roman" w:hAnsiTheme="majorBidi" w:cstheme="majorBidi"/>
-          <w:b/>
-          <w:bCs/>
-          <w:color w:val="27251E"/>
-          <w:sz w:val="24"/>
-          <w:szCs w:val="24"/>
-          <w:lang/>
-        </w:rPr>
-        <w:t xml:space="preserve">7. Troubleshooting </w:t>
-      </w:r>
-      <w:proofErr w:type="spellStart"/>
-      <w:r>
-        <w:rPr>
-          <w:rFonts w:asciiTheme="majorBidi" w:eastAsia="Times New Roman" w:hAnsiTheme="majorBidi" w:cstheme="majorBidi"/>
-          <w:b/>
-          <w:bCs/>
-          <w:color w:val="27251E"/>
-          <w:sz w:val="24"/>
-          <w:szCs w:val="24"/>
-          <w:lang/>
-        </w:rPr>
-        <w:t>MySQL</w:t>
-      </w:r>
-      <w:proofErr w:type="spellEnd"/>
-      <w:r>
-        <w:rPr>
-          <w:rFonts w:asciiTheme="majorBidi" w:eastAsia="Times New Roman" w:hAnsiTheme="majorBidi" w:cstheme="majorBidi"/>
-          <w:b/>
-          <w:bCs/>
-          <w:color w:val="27251E"/>
-          <w:sz w:val="24"/>
-          <w:szCs w:val="24"/>
-          <w:lang/>
-        </w:rPr>
-        <w:t xml:space="preserve"> latency</w:t>
-      </w:r>
-    </w:p>
-    <w:p>
-      <w:pPr>
-        <w:spacing w:before="100" w:beforeAutospacing="1" w:after="100" w:afterAutospacing="1" w:line="360" w:lineRule="auto"/>
-        <w:contextualSpacing/>
-        <w:rPr>
-          <w:rFonts w:asciiTheme="majorBidi" w:eastAsia="Times New Roman" w:hAnsiTheme="majorBidi" w:cstheme="majorBidi"/>
-          <w:color w:val="27251E"/>
-          <w:sz w:val="24"/>
-          <w:szCs w:val="24"/>
-          <w:lang/>
-        </w:rPr>
-      </w:pPr>
-      <w:r>
-        <w:rPr>
-          <w:rFonts w:asciiTheme="majorBidi" w:eastAsia="Times New Roman" w:hAnsiTheme="majorBidi" w:cstheme="majorBidi"/>
-          <w:color w:val="27251E"/>
-          <w:sz w:val="24"/>
-          <w:szCs w:val="24"/>
-          <w:lang/>
-        </w:rPr>
-        <w:t xml:space="preserve">If </w:t>
-      </w:r>
-      <w:proofErr w:type="spellStart"/>
-      <w:r>
-        <w:rPr>
-          <w:rFonts w:asciiTheme="majorBidi" w:eastAsia="Times New Roman" w:hAnsiTheme="majorBidi" w:cstheme="majorBidi"/>
-          <w:color w:val="27251E"/>
-          <w:sz w:val="24"/>
-          <w:szCs w:val="24"/>
-          <w:lang/>
-        </w:rPr>
-        <w:t>MySQL</w:t>
-      </w:r>
-      <w:proofErr w:type="spellEnd"/>
-      <w:r>
-        <w:rPr>
-          <w:rFonts w:asciiTheme="majorBidi" w:eastAsia="Times New Roman" w:hAnsiTheme="majorBidi" w:cstheme="majorBidi"/>
-          <w:color w:val="27251E"/>
-          <w:sz w:val="24"/>
-          <w:szCs w:val="24"/>
-          <w:lang/>
-        </w:rPr>
-        <w:t xml:space="preserve"> requests are slow, the latency may come from the network, the server load, or the SQL queries themselves. A practical troubleshooting flow is:</w:t>
+          <w:lang w:val="en-US"/>
+        </w:rPr>
+      </w:pPr>
+      <w:r>
+        <w:rPr>
+          <w:rFonts w:asciiTheme="majorBidi" w:eastAsia="Times New Roman" w:hAnsiTheme="majorBidi" w:cstheme="majorBidi"/>
+          <w:b/>
+          <w:bCs/>
+          <w:color w:val="27251E"/>
+          <w:sz w:val="24"/>
+          <w:szCs w:val="24"/>
+          <w:lang w:val="en-US"/>
+        </w:rPr>
+        <w:t>7. Troubleshooting MySQL latency</w:t>
+      </w:r>
+    </w:p>
+    <w:p>
+      <w:pPr>
+        <w:spacing w:before="100" w:beforeAutospacing="1" w:after="100" w:afterAutospacing="1" w:line="360" w:lineRule="auto"/>
+        <w:contextualSpacing/>
+        <w:rPr>
+          <w:rFonts w:asciiTheme="majorBidi" w:eastAsia="Times New Roman" w:hAnsiTheme="majorBidi" w:cstheme="majorBidi"/>
+          <w:color w:val="27251E"/>
+          <w:sz w:val="24"/>
+          <w:szCs w:val="24"/>
+        </w:rPr>
+      </w:pPr>
+      <w:r>
+        <w:rPr>
+          <w:rFonts w:asciiTheme="majorBidi" w:eastAsia="Times New Roman" w:hAnsiTheme="majorBidi" w:cstheme="majorBidi"/>
+          <w:color w:val="27251E"/>
+          <w:sz w:val="24"/>
+          <w:szCs w:val="24"/>
+          <w:lang w:val="en-US"/>
+        </w:rPr>
+        <w:t xml:space="preserve">If MySQL requests are slow, the latency may come from the network, the server load, or the SQL queries themselves. </w:t>
+      </w:r>
+      <w:r>
+        <w:rPr>
+          <w:rFonts w:asciiTheme="majorBidi" w:eastAsia="Times New Roman" w:hAnsiTheme="majorBidi" w:cstheme="majorBidi"/>
+          <w:color w:val="27251E"/>
+          <w:sz w:val="24"/>
+          <w:szCs w:val="24"/>
+        </w:rPr>
+        <w:t>A practical troubleshooting flow is:</w:t>
       </w:r>
     </w:p>
     <w:p>
@@ -3161,46 +2722,18 @@
           <w:color w:val="27251E"/>
           <w:sz w:val="24"/>
           <w:szCs w:val="24"/>
-          <w:lang/>
-        </w:rPr>
-      </w:pPr>
-      <w:r>
-        <w:rPr>
-          <w:rFonts w:asciiTheme="majorBidi" w:eastAsia="Times New Roman" w:hAnsiTheme="majorBidi" w:cstheme="majorBidi"/>
-          <w:b/>
-          <w:bCs/>
-          <w:color w:val="27251E"/>
-          <w:sz w:val="24"/>
-          <w:szCs w:val="24"/>
-          <w:lang/>
-        </w:rPr>
-        <w:t xml:space="preserve">Check network </w:t>
-      </w:r>
-      <w:proofErr w:type="spellStart"/>
-      <w:r>
-        <w:rPr>
-          <w:rFonts w:asciiTheme="majorBidi" w:eastAsia="Times New Roman" w:hAnsiTheme="majorBidi" w:cstheme="majorBidi"/>
-          <w:b/>
-          <w:bCs/>
-          <w:color w:val="27251E"/>
-          <w:sz w:val="24"/>
-          <w:szCs w:val="24"/>
-          <w:lang/>
-        </w:rPr>
-        <w:t>reachability</w:t>
-      </w:r>
-      <w:proofErr w:type="spellEnd"/>
-      <w:r>
-        <w:rPr>
-          <w:rFonts w:asciiTheme="majorBidi" w:eastAsia="Times New Roman" w:hAnsiTheme="majorBidi" w:cstheme="majorBidi"/>
-          <w:b/>
-          <w:bCs/>
-          <w:color w:val="27251E"/>
-          <w:sz w:val="24"/>
-          <w:szCs w:val="24"/>
-          <w:lang/>
-        </w:rPr>
-        <w:t xml:space="preserve"> and latency</w:t>
+        </w:rPr>
+      </w:pPr>
+      <w:r>
+        <w:rPr>
+          <w:rFonts w:asciiTheme="majorBidi" w:eastAsia="Times New Roman" w:hAnsiTheme="majorBidi" w:cstheme="majorBidi"/>
+          <w:b/>
+          <w:bCs/>
+          <w:color w:val="27251E"/>
+          <w:sz w:val="24"/>
+          <w:szCs w:val="24"/>
+        </w:rPr>
+        <w:t>Check network reachability and latency</w:t>
       </w:r>
     </w:p>
     <w:p>
@@ -3230,7 +2763,7 @@
           <w:color w:val="D6D5D4"/>
           <w:sz w:val="24"/>
           <w:szCs w:val="24"/>
-          <w:lang/>
+          <w:lang w:val="en-US"/>
         </w:rPr>
       </w:pPr>
       <w:proofErr w:type="gramStart"/>
@@ -3240,7 +2773,7 @@
           <w:color w:val="D6D5D4"/>
           <w:sz w:val="24"/>
           <w:szCs w:val="24"/>
-          <w:lang/>
+          <w:lang w:val="en-US"/>
         </w:rPr>
         <w:t>bash</w:t>
       </w:r>
@@ -3273,7 +2806,7 @@
           <w:color w:val="3F3B35"/>
           <w:sz w:val="24"/>
           <w:szCs w:val="24"/>
-          <w:lang/>
+          <w:lang w:val="en-US"/>
         </w:rPr>
       </w:pPr>
       <w:proofErr w:type="gramStart"/>
@@ -3283,7 +2816,7 @@
           <w:color w:val="953800"/>
           <w:sz w:val="24"/>
           <w:szCs w:val="24"/>
-          <w:lang/>
+          <w:lang w:val="en-US"/>
         </w:rPr>
         <w:t>ping</w:t>
       </w:r>
@@ -3294,44 +2827,10 @@
           <w:color w:val="3F3B35"/>
           <w:sz w:val="24"/>
           <w:szCs w:val="24"/>
-          <w:lang/>
-        </w:rPr>
-        <w:t xml:space="preserve"> </w:t>
-      </w:r>
-      <w:proofErr w:type="spellStart"/>
-      <w:r>
-        <w:rPr>
-          <w:rFonts w:asciiTheme="majorBidi" w:eastAsia="Times New Roman" w:hAnsiTheme="majorBidi" w:cstheme="majorBidi"/>
-          <w:color w:val="3F3B35"/>
-          <w:sz w:val="24"/>
-          <w:szCs w:val="24"/>
-          <w:lang/>
-        </w:rPr>
-        <w:t>mysql</w:t>
-      </w:r>
-      <w:proofErr w:type="spellEnd"/>
-      <w:r>
-        <w:rPr>
-          <w:rFonts w:asciiTheme="majorBidi" w:eastAsia="Times New Roman" w:hAnsiTheme="majorBidi" w:cstheme="majorBidi"/>
-          <w:color w:val="3F3B35"/>
-          <w:sz w:val="24"/>
-          <w:szCs w:val="24"/>
-          <w:lang/>
-        </w:rPr>
-        <w:t>-server-</w:t>
-      </w:r>
-      <w:proofErr w:type="spellStart"/>
-      <w:r>
-        <w:rPr>
-          <w:rFonts w:asciiTheme="majorBidi" w:eastAsia="Times New Roman" w:hAnsiTheme="majorBidi" w:cstheme="majorBidi"/>
-          <w:color w:val="3F3B35"/>
-          <w:sz w:val="24"/>
-          <w:szCs w:val="24"/>
-          <w:lang/>
-        </w:rPr>
-        <w:t>ip</w:t>
-      </w:r>
-      <w:proofErr w:type="spellEnd"/>
+          <w:lang w:val="en-US"/>
+        </w:rPr>
+        <w:t xml:space="preserve"> mysql-server-ip</w:t>
+      </w:r>
     </w:p>
     <w:p>
       <w:pPr>
@@ -3360,10 +2859,9 @@
           <w:color w:val="D6D5D4"/>
           <w:sz w:val="24"/>
           <w:szCs w:val="24"/>
-          <w:lang/>
-        </w:rPr>
-      </w:pPr>
-      <w:proofErr w:type="spellStart"/>
+          <w:lang w:val="en-US"/>
+        </w:rPr>
+      </w:pPr>
       <w:proofErr w:type="gramStart"/>
       <w:r>
         <w:rPr>
@@ -3371,11 +2869,10 @@
           <w:color w:val="953800"/>
           <w:sz w:val="24"/>
           <w:szCs w:val="24"/>
-          <w:lang/>
+          <w:lang w:val="en-US"/>
         </w:rPr>
         <w:t>traceroute</w:t>
       </w:r>
-      <w:proofErr w:type="spellEnd"/>
       <w:proofErr w:type="gramEnd"/>
       <w:r>
         <w:rPr>
@@ -3383,88 +2880,32 @@
           <w:color w:val="3F3B35"/>
           <w:sz w:val="24"/>
           <w:szCs w:val="24"/>
-          <w:lang/>
-        </w:rPr>
-        <w:t xml:space="preserve"> </w:t>
-      </w:r>
-      <w:proofErr w:type="spellStart"/>
-      <w:r>
-        <w:rPr>
-          <w:rFonts w:asciiTheme="majorBidi" w:eastAsia="Times New Roman" w:hAnsiTheme="majorBidi" w:cstheme="majorBidi"/>
-          <w:color w:val="3F3B35"/>
-          <w:sz w:val="24"/>
-          <w:szCs w:val="24"/>
-          <w:lang/>
-        </w:rPr>
-        <w:t>mysql</w:t>
-      </w:r>
-      <w:proofErr w:type="spellEnd"/>
-      <w:r>
-        <w:rPr>
-          <w:rFonts w:asciiTheme="majorBidi" w:eastAsia="Times New Roman" w:hAnsiTheme="majorBidi" w:cstheme="majorBidi"/>
-          <w:color w:val="3F3B35"/>
-          <w:sz w:val="24"/>
-          <w:szCs w:val="24"/>
-          <w:lang/>
-        </w:rPr>
-        <w:t>-server-</w:t>
-      </w:r>
-      <w:proofErr w:type="spellStart"/>
-      <w:r>
-        <w:rPr>
-          <w:rFonts w:asciiTheme="majorBidi" w:eastAsia="Times New Roman" w:hAnsiTheme="majorBidi" w:cstheme="majorBidi"/>
-          <w:color w:val="3F3B35"/>
-          <w:sz w:val="24"/>
-          <w:szCs w:val="24"/>
-          <w:lang/>
-        </w:rPr>
-        <w:t>ip</w:t>
-      </w:r>
-      <w:proofErr w:type="spellEnd"/>
-    </w:p>
-    <w:p>
-      <w:pPr>
-        <w:spacing w:before="100" w:beforeAutospacing="1" w:after="100" w:afterAutospacing="1" w:line="360" w:lineRule="auto"/>
-        <w:contextualSpacing/>
-        <w:rPr>
-          <w:rFonts w:asciiTheme="majorBidi" w:eastAsia="Times New Roman" w:hAnsiTheme="majorBidi" w:cstheme="majorBidi"/>
-          <w:color w:val="27251E"/>
-          <w:sz w:val="24"/>
-          <w:szCs w:val="24"/>
-          <w:lang/>
-        </w:rPr>
-      </w:pPr>
-      <w:r>
-        <w:rPr>
-          <w:rFonts w:asciiTheme="majorBidi" w:eastAsia="Times New Roman" w:hAnsiTheme="majorBidi" w:cstheme="majorBidi"/>
-          <w:color w:val="27251E"/>
-          <w:sz w:val="24"/>
-          <w:szCs w:val="24"/>
-          <w:lang/>
-        </w:rPr>
-        <w:t xml:space="preserve">This shows whether the client can reach the </w:t>
-      </w:r>
-      <w:proofErr w:type="spellStart"/>
-      <w:r>
-        <w:rPr>
-          <w:rFonts w:asciiTheme="majorBidi" w:eastAsia="Times New Roman" w:hAnsiTheme="majorBidi" w:cstheme="majorBidi"/>
-          <w:color w:val="27251E"/>
-          <w:sz w:val="24"/>
-          <w:szCs w:val="24"/>
-          <w:lang/>
-        </w:rPr>
-        <w:t>MySQL</w:t>
-      </w:r>
-      <w:proofErr w:type="spellEnd"/>
-      <w:r>
-        <w:rPr>
-          <w:rFonts w:asciiTheme="majorBidi" w:eastAsia="Times New Roman" w:hAnsiTheme="majorBidi" w:cstheme="majorBidi"/>
-          <w:color w:val="27251E"/>
-          <w:sz w:val="24"/>
-          <w:szCs w:val="24"/>
-          <w:lang/>
-        </w:rPr>
-        <w:t xml:space="preserve"> server and whether the network path is introducing noticeable delay.</w:t>
+          <w:lang w:val="en-US"/>
+        </w:rPr>
+        <w:t xml:space="preserve"> mysql-server-ip</w:t>
+      </w:r>
+    </w:p>
+    <w:p>
+      <w:pPr>
+        <w:spacing w:before="100" w:beforeAutospacing="1" w:after="100" w:afterAutospacing="1" w:line="360" w:lineRule="auto"/>
+        <w:contextualSpacing/>
+        <w:rPr>
+          <w:rFonts w:asciiTheme="majorBidi" w:eastAsia="Times New Roman" w:hAnsiTheme="majorBidi" w:cstheme="majorBidi"/>
+          <w:color w:val="27251E"/>
+          <w:sz w:val="24"/>
+          <w:szCs w:val="24"/>
+          <w:lang w:val="en-US"/>
+        </w:rPr>
+      </w:pPr>
+      <w:r>
+        <w:rPr>
+          <w:rFonts w:asciiTheme="majorBidi" w:eastAsia="Times New Roman" w:hAnsiTheme="majorBidi" w:cstheme="majorBidi"/>
+          <w:color w:val="27251E"/>
+          <w:sz w:val="24"/>
+          <w:szCs w:val="24"/>
+          <w:lang w:val="en-US"/>
+        </w:rPr>
+        <w:t>This shows whether the client can reach the MySQL server and whether the network path is introducing noticeable delay.</w:t>
       </w:r>
     </w:p>
     <w:p>
@@ -3481,46 +2922,20 @@
           <w:color w:val="27251E"/>
           <w:sz w:val="24"/>
           <w:szCs w:val="24"/>
-          <w:lang/>
-        </w:rPr>
-      </w:pPr>
-      <w:r>
-        <w:rPr>
-          <w:rFonts w:asciiTheme="majorBidi" w:eastAsia="Times New Roman" w:hAnsiTheme="majorBidi" w:cstheme="majorBidi"/>
-          <w:b/>
-          <w:bCs/>
-          <w:color w:val="27251E"/>
-          <w:sz w:val="24"/>
-          <w:szCs w:val="24"/>
-          <w:lang/>
-        </w:rPr>
-        <w:t xml:space="preserve">Check whether the </w:t>
-      </w:r>
-      <w:proofErr w:type="spellStart"/>
-      <w:r>
-        <w:rPr>
-          <w:rFonts w:asciiTheme="majorBidi" w:eastAsia="Times New Roman" w:hAnsiTheme="majorBidi" w:cstheme="majorBidi"/>
-          <w:b/>
-          <w:bCs/>
-          <w:color w:val="27251E"/>
-          <w:sz w:val="24"/>
-          <w:szCs w:val="24"/>
-          <w:lang/>
-        </w:rPr>
-        <w:t>MySQL</w:t>
-      </w:r>
-      <w:proofErr w:type="spellEnd"/>
-      <w:r>
-        <w:rPr>
-          <w:rFonts w:asciiTheme="majorBidi" w:eastAsia="Times New Roman" w:hAnsiTheme="majorBidi" w:cstheme="majorBidi"/>
-          <w:b/>
-          <w:bCs/>
-          <w:color w:val="27251E"/>
-          <w:sz w:val="24"/>
-          <w:szCs w:val="24"/>
-          <w:lang/>
-        </w:rPr>
-        <w:t xml:space="preserve"> service is responding</w:t>
+          <w:lang w:val="en-US"/>
+        </w:rPr>
+      </w:pPr>
+      <w:r>
+        <w:rPr>
+          <w:rFonts w:asciiTheme="majorBidi" w:eastAsia="Times New Roman" w:hAnsiTheme="majorBidi" w:cstheme="majorBidi"/>
+          <w:b/>
+          <w:bCs/>
+          <w:color w:val="27251E"/>
+          <w:sz w:val="24"/>
+          <w:szCs w:val="24"/>
+          <w:lang w:val="en-US"/>
+        </w:rPr>
+        <w:t>Check whether the MySQL service is responding</w:t>
       </w:r>
     </w:p>
     <w:p>
@@ -3550,7 +2965,7 @@
           <w:color w:val="D6D5D4"/>
           <w:sz w:val="24"/>
           <w:szCs w:val="24"/>
-          <w:lang/>
+          <w:lang w:val="en-US"/>
         </w:rPr>
       </w:pPr>
       <w:proofErr w:type="gramStart"/>
@@ -3560,7 +2975,7 @@
           <w:color w:val="D6D5D4"/>
           <w:sz w:val="24"/>
           <w:szCs w:val="24"/>
-          <w:lang/>
+          <w:lang w:val="en-US"/>
         </w:rPr>
         <w:t>bash</w:t>
       </w:r>
@@ -3593,10 +3008,9 @@
           <w:color w:val="D6D5D4"/>
           <w:sz w:val="24"/>
           <w:szCs w:val="24"/>
-          <w:lang/>
-        </w:rPr>
-      </w:pPr>
-      <w:proofErr w:type="spellStart"/>
+          <w:lang w:val="en-US"/>
+        </w:rPr>
+      </w:pPr>
       <w:proofErr w:type="gramStart"/>
       <w:r>
         <w:rPr>
@@ -3604,11 +3018,10 @@
           <w:color w:val="3F3B35"/>
           <w:sz w:val="24"/>
           <w:szCs w:val="24"/>
-          <w:lang/>
+          <w:lang w:val="en-US"/>
         </w:rPr>
         <w:t>mysql</w:t>
       </w:r>
-      <w:proofErr w:type="spellEnd"/>
       <w:proofErr w:type="gramEnd"/>
       <w:r>
         <w:rPr>
@@ -3616,74 +3029,30 @@
           <w:color w:val="3F3B35"/>
           <w:sz w:val="24"/>
           <w:szCs w:val="24"/>
-          <w:lang/>
-        </w:rPr>
-        <w:t xml:space="preserve"> -u username -h </w:t>
-      </w:r>
-      <w:proofErr w:type="spellStart"/>
-      <w:r>
-        <w:rPr>
-          <w:rFonts w:asciiTheme="majorBidi" w:eastAsia="Times New Roman" w:hAnsiTheme="majorBidi" w:cstheme="majorBidi"/>
-          <w:color w:val="3F3B35"/>
-          <w:sz w:val="24"/>
-          <w:szCs w:val="24"/>
-          <w:lang/>
-        </w:rPr>
-        <w:t>mysql</w:t>
-      </w:r>
-      <w:proofErr w:type="spellEnd"/>
-      <w:r>
-        <w:rPr>
-          <w:rFonts w:asciiTheme="majorBidi" w:eastAsia="Times New Roman" w:hAnsiTheme="majorBidi" w:cstheme="majorBidi"/>
-          <w:color w:val="3F3B35"/>
-          <w:sz w:val="24"/>
-          <w:szCs w:val="24"/>
-          <w:lang/>
-        </w:rPr>
-        <w:t>-server-</w:t>
-      </w:r>
-      <w:proofErr w:type="spellStart"/>
-      <w:r>
-        <w:rPr>
-          <w:rFonts w:asciiTheme="majorBidi" w:eastAsia="Times New Roman" w:hAnsiTheme="majorBidi" w:cstheme="majorBidi"/>
-          <w:color w:val="3F3B35"/>
-          <w:sz w:val="24"/>
-          <w:szCs w:val="24"/>
-          <w:lang/>
-        </w:rPr>
-        <w:t>ip</w:t>
-      </w:r>
-      <w:proofErr w:type="spellEnd"/>
-      <w:r>
-        <w:rPr>
-          <w:rFonts w:asciiTheme="majorBidi" w:eastAsia="Times New Roman" w:hAnsiTheme="majorBidi" w:cstheme="majorBidi"/>
-          <w:color w:val="3F3B35"/>
-          <w:sz w:val="24"/>
-          <w:szCs w:val="24"/>
-          <w:lang/>
-        </w:rPr>
-        <w:t xml:space="preserve"> -p</w:t>
-      </w:r>
-    </w:p>
-    <w:p>
-      <w:pPr>
-        <w:spacing w:before="100" w:beforeAutospacing="1" w:after="100" w:afterAutospacing="1" w:line="360" w:lineRule="auto"/>
-        <w:contextualSpacing/>
-        <w:rPr>
-          <w:rFonts w:asciiTheme="majorBidi" w:eastAsia="Times New Roman" w:hAnsiTheme="majorBidi" w:cstheme="majorBidi"/>
-          <w:color w:val="27251E"/>
-          <w:sz w:val="24"/>
-          <w:szCs w:val="24"/>
-          <w:lang/>
-        </w:rPr>
-      </w:pPr>
-      <w:r>
-        <w:rPr>
-          <w:rFonts w:asciiTheme="majorBidi" w:eastAsia="Times New Roman" w:hAnsiTheme="majorBidi" w:cstheme="majorBidi"/>
-          <w:color w:val="27251E"/>
-          <w:sz w:val="24"/>
-          <w:szCs w:val="24"/>
-          <w:lang/>
+          <w:lang w:val="en-US"/>
+        </w:rPr>
+        <w:t xml:space="preserve"> -u username -h mysql-server-ip -p</w:t>
+      </w:r>
+    </w:p>
+    <w:p>
+      <w:pPr>
+        <w:spacing w:before="100" w:beforeAutospacing="1" w:after="100" w:afterAutospacing="1" w:line="360" w:lineRule="auto"/>
+        <w:contextualSpacing/>
+        <w:rPr>
+          <w:rFonts w:asciiTheme="majorBidi" w:eastAsia="Times New Roman" w:hAnsiTheme="majorBidi" w:cstheme="majorBidi"/>
+          <w:color w:val="27251E"/>
+          <w:sz w:val="24"/>
+          <w:szCs w:val="24"/>
+          <w:lang w:val="en-US"/>
+        </w:rPr>
+      </w:pPr>
+      <w:r>
+        <w:rPr>
+          <w:rFonts w:asciiTheme="majorBidi" w:eastAsia="Times New Roman" w:hAnsiTheme="majorBidi" w:cstheme="majorBidi"/>
+          <w:color w:val="27251E"/>
+          <w:sz w:val="24"/>
+          <w:szCs w:val="24"/>
+          <w:lang w:val="en-US"/>
         </w:rPr>
         <w:t>If the connection is slow even before running queries, look at network latency, firewall rules, or server resource pressure.</w:t>
       </w:r>
@@ -3702,18 +3071,16 @@
           <w:color w:val="27251E"/>
           <w:sz w:val="24"/>
           <w:szCs w:val="24"/>
-          <w:lang/>
-        </w:rPr>
-      </w:pPr>
-      <w:r>
-        <w:rPr>
-          <w:rFonts w:asciiTheme="majorBidi" w:eastAsia="Times New Roman" w:hAnsiTheme="majorBidi" w:cstheme="majorBidi"/>
-          <w:b/>
-          <w:bCs/>
-          <w:color w:val="27251E"/>
-          <w:sz w:val="24"/>
-          <w:szCs w:val="24"/>
-          <w:lang/>
+        </w:rPr>
+      </w:pPr>
+      <w:r>
+        <w:rPr>
+          <w:rFonts w:asciiTheme="majorBidi" w:eastAsia="Times New Roman" w:hAnsiTheme="majorBidi" w:cstheme="majorBidi"/>
+          <w:b/>
+          <w:bCs/>
+          <w:color w:val="27251E"/>
+          <w:sz w:val="24"/>
+          <w:szCs w:val="24"/>
         </w:rPr>
         <w:t>Look for slow queries</w:t>
       </w:r>
@@ -3745,10 +3112,8 @@
           <w:color w:val="D6D5D4"/>
           <w:sz w:val="24"/>
           <w:szCs w:val="24"/>
-          <w:lang/>
-        </w:rPr>
-      </w:pPr>
-      <w:proofErr w:type="spellStart"/>
+        </w:rPr>
+      </w:pPr>
       <w:proofErr w:type="gramStart"/>
       <w:r>
         <w:rPr>
@@ -3756,11 +3121,9 @@
           <w:color w:val="D6D5D4"/>
           <w:sz w:val="24"/>
           <w:szCs w:val="24"/>
-          <w:lang/>
         </w:rPr>
         <w:t>sql</w:t>
       </w:r>
-      <w:proofErr w:type="spellEnd"/>
       <w:proofErr w:type="gramEnd"/>
     </w:p>
     <w:p>
@@ -3790,7 +3153,7 @@
           <w:color w:val="3F3B35"/>
           <w:sz w:val="24"/>
           <w:szCs w:val="24"/>
-          <w:lang/>
+          <w:lang w:val="en-US"/>
         </w:rPr>
       </w:pPr>
       <w:r>
@@ -3801,7 +3164,7 @@
           <w:color w:val="CF222E"/>
           <w:sz w:val="24"/>
           <w:szCs w:val="24"/>
-          <w:lang/>
+          <w:lang w:val="en-US"/>
         </w:rPr>
         <w:t>SHOW</w:t>
       </w:r>
@@ -3811,7 +3174,7 @@
           <w:color w:val="3F3B35"/>
           <w:sz w:val="24"/>
           <w:szCs w:val="24"/>
-          <w:lang/>
+          <w:lang w:val="en-US"/>
         </w:rPr>
         <w:t xml:space="preserve"> VARIABLES LIKE </w:t>
       </w:r>
@@ -3821,39 +3184,17 @@
           <w:color w:val="0A3069"/>
           <w:sz w:val="24"/>
           <w:szCs w:val="24"/>
-          <w:lang/>
-        </w:rPr>
-        <w:t>'</w:t>
-      </w:r>
-      <w:proofErr w:type="spellStart"/>
-      <w:r>
-        <w:rPr>
-          <w:rFonts w:asciiTheme="majorBidi" w:eastAsia="Times New Roman" w:hAnsiTheme="majorBidi" w:cstheme="majorBidi"/>
-          <w:color w:val="0A3069"/>
-          <w:sz w:val="24"/>
-          <w:szCs w:val="24"/>
-          <w:lang/>
-        </w:rPr>
-        <w:t>slow_query</w:t>
-      </w:r>
-      <w:proofErr w:type="spellEnd"/>
-      <w:r>
-        <w:rPr>
-          <w:rFonts w:asciiTheme="majorBidi" w:eastAsia="Times New Roman" w:hAnsiTheme="majorBidi" w:cstheme="majorBidi"/>
-          <w:color w:val="0A3069"/>
-          <w:sz w:val="24"/>
-          <w:szCs w:val="24"/>
-          <w:lang/>
-        </w:rPr>
-        <w:t>%'</w:t>
-      </w:r>
-      <w:r>
-        <w:rPr>
-          <w:rFonts w:asciiTheme="majorBidi" w:eastAsia="Times New Roman" w:hAnsiTheme="majorBidi" w:cstheme="majorBidi"/>
-          <w:color w:val="3F3B35"/>
-          <w:sz w:val="24"/>
-          <w:szCs w:val="24"/>
-          <w:lang/>
+          <w:lang w:val="en-US"/>
+        </w:rPr>
+        <w:t>'slow_query%'</w:t>
+      </w:r>
+      <w:r>
+        <w:rPr>
+          <w:rFonts w:asciiTheme="majorBidi" w:eastAsia="Times New Roman" w:hAnsiTheme="majorBidi" w:cstheme="majorBidi"/>
+          <w:color w:val="3F3B35"/>
+          <w:sz w:val="24"/>
+          <w:szCs w:val="24"/>
+          <w:lang w:val="en-US"/>
         </w:rPr>
         <w:t>;</w:t>
       </w:r>
@@ -3885,7 +3226,7 @@
           <w:color w:val="D6D5D4"/>
           <w:sz w:val="24"/>
           <w:szCs w:val="24"/>
-          <w:lang/>
+          <w:lang w:val="en-US"/>
         </w:rPr>
       </w:pPr>
       <w:r>
@@ -3896,7 +3237,7 @@
           <w:color w:val="CF222E"/>
           <w:sz w:val="24"/>
           <w:szCs w:val="24"/>
-          <w:lang/>
+          <w:lang w:val="en-US"/>
         </w:rPr>
         <w:lastRenderedPageBreak/>
         <w:t>SHOW</w:t>
@@ -3907,7 +3248,7 @@
           <w:color w:val="3F3B35"/>
           <w:sz w:val="24"/>
           <w:szCs w:val="24"/>
-          <w:lang/>
+          <w:lang w:val="en-US"/>
         </w:rPr>
         <w:t xml:space="preserve"> VARIABLES LIKE </w:t>
       </w:r>
@@ -3917,39 +3258,17 @@
           <w:color w:val="0A3069"/>
           <w:sz w:val="24"/>
           <w:szCs w:val="24"/>
-          <w:lang/>
-        </w:rPr>
-        <w:t>'</w:t>
-      </w:r>
-      <w:proofErr w:type="spellStart"/>
-      <w:r>
-        <w:rPr>
-          <w:rFonts w:asciiTheme="majorBidi" w:eastAsia="Times New Roman" w:hAnsiTheme="majorBidi" w:cstheme="majorBidi"/>
-          <w:color w:val="0A3069"/>
-          <w:sz w:val="24"/>
-          <w:szCs w:val="24"/>
-          <w:lang/>
-        </w:rPr>
-        <w:t>long_query_time</w:t>
-      </w:r>
-      <w:proofErr w:type="spellEnd"/>
-      <w:r>
-        <w:rPr>
-          <w:rFonts w:asciiTheme="majorBidi" w:eastAsia="Times New Roman" w:hAnsiTheme="majorBidi" w:cstheme="majorBidi"/>
-          <w:color w:val="0A3069"/>
-          <w:sz w:val="24"/>
-          <w:szCs w:val="24"/>
-          <w:lang/>
-        </w:rPr>
-        <w:t>'</w:t>
-      </w:r>
-      <w:r>
-        <w:rPr>
-          <w:rFonts w:asciiTheme="majorBidi" w:eastAsia="Times New Roman" w:hAnsiTheme="majorBidi" w:cstheme="majorBidi"/>
-          <w:color w:val="3F3B35"/>
-          <w:sz w:val="24"/>
-          <w:szCs w:val="24"/>
-          <w:lang/>
+          <w:lang w:val="en-US"/>
+        </w:rPr>
+        <w:t>'long_query_time'</w:t>
+      </w:r>
+      <w:r>
+        <w:rPr>
+          <w:rFonts w:asciiTheme="majorBidi" w:eastAsia="Times New Roman" w:hAnsiTheme="majorBidi" w:cstheme="majorBidi"/>
+          <w:color w:val="3F3B35"/>
+          <w:sz w:val="24"/>
+          <w:szCs w:val="24"/>
+          <w:lang w:val="en-US"/>
         </w:rPr>
         <w:t>;</w:t>
       </w:r>
@@ -3963,30 +3282,18 @@
           <w:color w:val="27251E"/>
           <w:sz w:val="24"/>
           <w:szCs w:val="24"/>
-          <w:lang/>
-        </w:rPr>
-      </w:pPr>
-      <w:proofErr w:type="spellStart"/>
-      <w:r>
-        <w:rPr>
-          <w:rFonts w:asciiTheme="majorBidi" w:eastAsia="Times New Roman" w:hAnsiTheme="majorBidi" w:cstheme="majorBidi"/>
-          <w:color w:val="27251E"/>
-          <w:sz w:val="24"/>
-          <w:szCs w:val="24"/>
-          <w:lang/>
-        </w:rPr>
-        <w:t>MySQL</w:t>
-      </w:r>
-      <w:proofErr w:type="spellEnd"/>
-      <w:r>
-        <w:rPr>
-          <w:rFonts w:asciiTheme="majorBidi" w:eastAsia="Times New Roman" w:hAnsiTheme="majorBidi" w:cstheme="majorBidi"/>
-          <w:color w:val="27251E"/>
-          <w:sz w:val="24"/>
-          <w:szCs w:val="24"/>
-          <w:lang/>
-        </w:rPr>
-        <w:t xml:space="preserve"> performance troubleshooting often starts with the slow query log, which helps identify statements taking too long to execute.</w:t>
+          <w:lang w:val="en-US"/>
+        </w:rPr>
+      </w:pPr>
+      <w:r>
+        <w:rPr>
+          <w:rFonts w:asciiTheme="majorBidi" w:eastAsia="Times New Roman" w:hAnsiTheme="majorBidi" w:cstheme="majorBidi"/>
+          <w:color w:val="27251E"/>
+          <w:sz w:val="24"/>
+          <w:szCs w:val="24"/>
+          <w:lang w:val="en-US"/>
+        </w:rPr>
+        <w:t>MySQL performance troubleshooting often starts with the slow query log, which helps identify statements taking too long to execute.</w:t>
       </w:r>
     </w:p>
     <w:p>
@@ -4003,18 +3310,16 @@
           <w:color w:val="27251E"/>
           <w:sz w:val="24"/>
           <w:szCs w:val="24"/>
-          <w:lang/>
-        </w:rPr>
-      </w:pPr>
-      <w:r>
-        <w:rPr>
-          <w:rFonts w:asciiTheme="majorBidi" w:eastAsia="Times New Roman" w:hAnsiTheme="majorBidi" w:cstheme="majorBidi"/>
-          <w:b/>
-          <w:bCs/>
-          <w:color w:val="27251E"/>
-          <w:sz w:val="24"/>
-          <w:szCs w:val="24"/>
-          <w:lang/>
+        </w:rPr>
+      </w:pPr>
+      <w:r>
+        <w:rPr>
+          <w:rFonts w:asciiTheme="majorBidi" w:eastAsia="Times New Roman" w:hAnsiTheme="majorBidi" w:cstheme="majorBidi"/>
+          <w:b/>
+          <w:bCs/>
+          <w:color w:val="27251E"/>
+          <w:sz w:val="24"/>
+          <w:szCs w:val="24"/>
         </w:rPr>
         <w:t>Inspect query execution</w:t>
       </w:r>
@@ -4046,10 +3351,8 @@
           <w:color w:val="D6D5D4"/>
           <w:sz w:val="24"/>
           <w:szCs w:val="24"/>
-          <w:lang/>
-        </w:rPr>
-      </w:pPr>
-      <w:proofErr w:type="spellStart"/>
+        </w:rPr>
+      </w:pPr>
       <w:proofErr w:type="gramStart"/>
       <w:r>
         <w:rPr>
@@ -4057,11 +3360,9 @@
           <w:color w:val="D6D5D4"/>
           <w:sz w:val="24"/>
           <w:szCs w:val="24"/>
-          <w:lang/>
         </w:rPr>
         <w:t>sql</w:t>
       </w:r>
-      <w:proofErr w:type="spellEnd"/>
       <w:proofErr w:type="gramEnd"/>
     </w:p>
     <w:p>
@@ -4091,7 +3392,7 @@
           <w:color w:val="D6D5D4"/>
           <w:sz w:val="24"/>
           <w:szCs w:val="24"/>
-          <w:lang/>
+          <w:lang w:val="en-US"/>
         </w:rPr>
       </w:pPr>
       <w:r>
@@ -4102,7 +3403,7 @@
           <w:color w:val="CF222E"/>
           <w:sz w:val="24"/>
           <w:szCs w:val="24"/>
-          <w:lang/>
+          <w:lang w:val="en-US"/>
         </w:rPr>
         <w:t>EXPLAIN</w:t>
       </w:r>
@@ -4112,7 +3413,7 @@
           <w:color w:val="3F3B35"/>
           <w:sz w:val="24"/>
           <w:szCs w:val="24"/>
-          <w:lang/>
+          <w:lang w:val="en-US"/>
         </w:rPr>
         <w:t xml:space="preserve"> </w:t>
       </w:r>
@@ -4124,7 +3425,7 @@
           <w:color w:val="CF222E"/>
           <w:sz w:val="24"/>
           <w:szCs w:val="24"/>
-          <w:lang/>
+          <w:lang w:val="en-US"/>
         </w:rPr>
         <w:t>SELECT</w:t>
       </w:r>
@@ -4134,7 +3435,7 @@
           <w:color w:val="3F3B35"/>
           <w:sz w:val="24"/>
           <w:szCs w:val="24"/>
-          <w:lang/>
+          <w:lang w:val="en-US"/>
         </w:rPr>
         <w:t xml:space="preserve"> * </w:t>
       </w:r>
@@ -4146,7 +3447,7 @@
           <w:color w:val="CF222E"/>
           <w:sz w:val="24"/>
           <w:szCs w:val="24"/>
-          <w:lang/>
+          <w:lang w:val="en-US"/>
         </w:rPr>
         <w:t>FROM</w:t>
       </w:r>
@@ -4156,7 +3457,7 @@
           <w:color w:val="3F3B35"/>
           <w:sz w:val="24"/>
           <w:szCs w:val="24"/>
-          <w:lang/>
+          <w:lang w:val="en-US"/>
         </w:rPr>
         <w:t xml:space="preserve"> books </w:t>
       </w:r>
@@ -4168,7 +3469,7 @@
           <w:color w:val="CF222E"/>
           <w:sz w:val="24"/>
           <w:szCs w:val="24"/>
-          <w:lang/>
+          <w:lang w:val="en-US"/>
         </w:rPr>
         <w:t>WHERE</w:t>
       </w:r>
@@ -4178,7 +3479,7 @@
           <w:color w:val="3F3B35"/>
           <w:sz w:val="24"/>
           <w:szCs w:val="24"/>
-          <w:lang/>
+          <w:lang w:val="en-US"/>
         </w:rPr>
         <w:t xml:space="preserve"> author = </w:t>
       </w:r>
@@ -4188,7 +3489,7 @@
           <w:color w:val="0A3069"/>
           <w:sz w:val="24"/>
           <w:szCs w:val="24"/>
-          <w:lang/>
+          <w:lang w:val="en-US"/>
         </w:rPr>
         <w:t>'Robert C. Martin'</w:t>
       </w:r>
@@ -4198,7 +3499,7 @@
           <w:color w:val="3F3B35"/>
           <w:sz w:val="24"/>
           <w:szCs w:val="24"/>
-          <w:lang/>
+          <w:lang w:val="en-US"/>
         </w:rPr>
         <w:t>;</w:t>
       </w:r>
@@ -4212,40 +3513,18 @@
           <w:color w:val="27251E"/>
           <w:sz w:val="24"/>
           <w:szCs w:val="24"/>
-          <w:lang/>
-        </w:rPr>
-      </w:pPr>
-      <w:r>
-        <w:rPr>
-          <w:rFonts w:asciiTheme="majorBidi" w:eastAsia="Times New Roman" w:hAnsiTheme="majorBidi" w:cstheme="majorBidi"/>
-          <w:color w:val="27251E"/>
-          <w:sz w:val="24"/>
-          <w:szCs w:val="24"/>
-          <w:lang/>
-        </w:rPr>
-        <w:t xml:space="preserve">EXPLAIN helps show whether </w:t>
-      </w:r>
-      <w:proofErr w:type="spellStart"/>
-      <w:r>
-        <w:rPr>
-          <w:rFonts w:asciiTheme="majorBidi" w:eastAsia="Times New Roman" w:hAnsiTheme="majorBidi" w:cstheme="majorBidi"/>
-          <w:color w:val="27251E"/>
-          <w:sz w:val="24"/>
-          <w:szCs w:val="24"/>
-          <w:lang/>
-        </w:rPr>
-        <w:t>MySQL</w:t>
-      </w:r>
-      <w:proofErr w:type="spellEnd"/>
-      <w:r>
-        <w:rPr>
-          <w:rFonts w:asciiTheme="majorBidi" w:eastAsia="Times New Roman" w:hAnsiTheme="majorBidi" w:cstheme="majorBidi"/>
-          <w:color w:val="27251E"/>
-          <w:sz w:val="24"/>
-          <w:szCs w:val="24"/>
-          <w:lang/>
-        </w:rPr>
-        <w:t xml:space="preserve"> is scanning too many rows or missing useful indexes, which is a common cause of latency.</w:t>
+          <w:lang w:val="en-US"/>
+        </w:rPr>
+      </w:pPr>
+      <w:r>
+        <w:rPr>
+          <w:rFonts w:asciiTheme="majorBidi" w:eastAsia="Times New Roman" w:hAnsiTheme="majorBidi" w:cstheme="majorBidi"/>
+          <w:color w:val="27251E"/>
+          <w:sz w:val="24"/>
+          <w:szCs w:val="24"/>
+          <w:lang w:val="en-US"/>
+        </w:rPr>
+        <w:t>EXPLAIN helps show whether MySQL is scanning too many rows or missing useful indexes, which is a common cause of latency.</w:t>
       </w:r>
     </w:p>
     <w:p>
@@ -4262,18 +3541,16 @@
           <w:color w:val="27251E"/>
           <w:sz w:val="24"/>
           <w:szCs w:val="24"/>
-          <w:lang/>
-        </w:rPr>
-      </w:pPr>
-      <w:r>
-        <w:rPr>
-          <w:rFonts w:asciiTheme="majorBidi" w:eastAsia="Times New Roman" w:hAnsiTheme="majorBidi" w:cstheme="majorBidi"/>
-          <w:b/>
-          <w:bCs/>
-          <w:color w:val="27251E"/>
-          <w:sz w:val="24"/>
-          <w:szCs w:val="24"/>
-          <w:lang/>
+        </w:rPr>
+      </w:pPr>
+      <w:r>
+        <w:rPr>
+          <w:rFonts w:asciiTheme="majorBidi" w:eastAsia="Times New Roman" w:hAnsiTheme="majorBidi" w:cstheme="majorBidi"/>
+          <w:b/>
+          <w:bCs/>
+          <w:color w:val="27251E"/>
+          <w:sz w:val="24"/>
+          <w:szCs w:val="24"/>
         </w:rPr>
         <w:t>Check connections and load</w:t>
       </w:r>
@@ -4305,10 +3582,8 @@
           <w:color w:val="D6D5D4"/>
           <w:sz w:val="24"/>
           <w:szCs w:val="24"/>
-          <w:lang/>
-        </w:rPr>
-      </w:pPr>
-      <w:proofErr w:type="spellStart"/>
+        </w:rPr>
+      </w:pPr>
       <w:proofErr w:type="gramStart"/>
       <w:r>
         <w:rPr>
@@ -4316,11 +3591,9 @@
           <w:color w:val="D6D5D4"/>
           <w:sz w:val="24"/>
           <w:szCs w:val="24"/>
-          <w:lang/>
         </w:rPr>
         <w:t>sql</w:t>
       </w:r>
-      <w:proofErr w:type="spellEnd"/>
       <w:proofErr w:type="gramEnd"/>
     </w:p>
     <w:p>
@@ -4350,7 +3623,7 @@
           <w:color w:val="3F3B35"/>
           <w:sz w:val="24"/>
           <w:szCs w:val="24"/>
-          <w:lang/>
+          <w:lang w:val="en-US"/>
         </w:rPr>
       </w:pPr>
       <w:r>
@@ -4361,7 +3634,7 @@
           <w:color w:val="CF222E"/>
           <w:sz w:val="24"/>
           <w:szCs w:val="24"/>
-          <w:lang/>
+          <w:lang w:val="en-US"/>
         </w:rPr>
         <w:t>SHOW</w:t>
       </w:r>
@@ -4371,7 +3644,7 @@
           <w:color w:val="3F3B35"/>
           <w:sz w:val="24"/>
           <w:szCs w:val="24"/>
-          <w:lang/>
+          <w:lang w:val="en-US"/>
         </w:rPr>
         <w:t xml:space="preserve"> </w:t>
       </w:r>
@@ -4383,7 +3656,7 @@
           <w:color w:val="CF222E"/>
           <w:sz w:val="24"/>
           <w:szCs w:val="24"/>
-          <w:lang/>
+          <w:lang w:val="en-US"/>
         </w:rPr>
         <w:t>STATUS</w:t>
       </w:r>
@@ -4393,7 +3666,7 @@
           <w:color w:val="3F3B35"/>
           <w:sz w:val="24"/>
           <w:szCs w:val="24"/>
-          <w:lang/>
+          <w:lang w:val="en-US"/>
         </w:rPr>
         <w:t xml:space="preserve"> LIKE </w:t>
       </w:r>
@@ -4403,39 +3676,17 @@
           <w:color w:val="0A3069"/>
           <w:sz w:val="24"/>
           <w:szCs w:val="24"/>
-          <w:lang/>
-        </w:rPr>
-        <w:t>'</w:t>
-      </w:r>
-      <w:proofErr w:type="spellStart"/>
-      <w:r>
-        <w:rPr>
-          <w:rFonts w:asciiTheme="majorBidi" w:eastAsia="Times New Roman" w:hAnsiTheme="majorBidi" w:cstheme="majorBidi"/>
-          <w:color w:val="0A3069"/>
-          <w:sz w:val="24"/>
-          <w:szCs w:val="24"/>
-          <w:lang/>
-        </w:rPr>
-        <w:t>Threads_connected</w:t>
-      </w:r>
-      <w:proofErr w:type="spellEnd"/>
-      <w:r>
-        <w:rPr>
-          <w:rFonts w:asciiTheme="majorBidi" w:eastAsia="Times New Roman" w:hAnsiTheme="majorBidi" w:cstheme="majorBidi"/>
-          <w:color w:val="0A3069"/>
-          <w:sz w:val="24"/>
-          <w:szCs w:val="24"/>
-          <w:lang/>
-        </w:rPr>
-        <w:t>'</w:t>
-      </w:r>
-      <w:r>
-        <w:rPr>
-          <w:rFonts w:asciiTheme="majorBidi" w:eastAsia="Times New Roman" w:hAnsiTheme="majorBidi" w:cstheme="majorBidi"/>
-          <w:color w:val="3F3B35"/>
-          <w:sz w:val="24"/>
-          <w:szCs w:val="24"/>
-          <w:lang/>
+          <w:lang w:val="en-US"/>
+        </w:rPr>
+        <w:t>'Threads_connected'</w:t>
+      </w:r>
+      <w:r>
+        <w:rPr>
+          <w:rFonts w:asciiTheme="majorBidi" w:eastAsia="Times New Roman" w:hAnsiTheme="majorBidi" w:cstheme="majorBidi"/>
+          <w:color w:val="3F3B35"/>
+          <w:sz w:val="24"/>
+          <w:szCs w:val="24"/>
+          <w:lang w:val="en-US"/>
         </w:rPr>
         <w:t>;</w:t>
       </w:r>
@@ -4467,7 +3718,7 @@
           <w:color w:val="D6D5D4"/>
           <w:sz w:val="24"/>
           <w:szCs w:val="24"/>
-          <w:lang/>
+          <w:lang w:val="en-US"/>
         </w:rPr>
       </w:pPr>
       <w:r>
@@ -4478,7 +3729,7 @@
           <w:color w:val="CF222E"/>
           <w:sz w:val="24"/>
           <w:szCs w:val="24"/>
-          <w:lang/>
+          <w:lang w:val="en-US"/>
         </w:rPr>
         <w:t>SHOW</w:t>
       </w:r>
@@ -4488,7 +3739,7 @@
           <w:color w:val="3F3B35"/>
           <w:sz w:val="24"/>
           <w:szCs w:val="24"/>
-          <w:lang/>
+          <w:lang w:val="en-US"/>
         </w:rPr>
         <w:t xml:space="preserve"> </w:t>
       </w:r>
@@ -4500,7 +3751,7 @@
           <w:color w:val="CF222E"/>
           <w:sz w:val="24"/>
           <w:szCs w:val="24"/>
-          <w:lang/>
+          <w:lang w:val="en-US"/>
         </w:rPr>
         <w:t>STATUS</w:t>
       </w:r>
@@ -4510,7 +3761,7 @@
           <w:color w:val="3F3B35"/>
           <w:sz w:val="24"/>
           <w:szCs w:val="24"/>
-          <w:lang/>
+          <w:lang w:val="en-US"/>
         </w:rPr>
         <w:t xml:space="preserve"> LIKE </w:t>
       </w:r>
@@ -4520,39 +3771,17 @@
           <w:color w:val="0A3069"/>
           <w:sz w:val="24"/>
           <w:szCs w:val="24"/>
-          <w:lang/>
-        </w:rPr>
-        <w:t>'</w:t>
-      </w:r>
-      <w:proofErr w:type="spellStart"/>
-      <w:r>
-        <w:rPr>
-          <w:rFonts w:asciiTheme="majorBidi" w:eastAsia="Times New Roman" w:hAnsiTheme="majorBidi" w:cstheme="majorBidi"/>
-          <w:color w:val="0A3069"/>
-          <w:sz w:val="24"/>
-          <w:szCs w:val="24"/>
-          <w:lang/>
-        </w:rPr>
-        <w:t>Aborted_connects</w:t>
-      </w:r>
-      <w:proofErr w:type="spellEnd"/>
-      <w:r>
-        <w:rPr>
-          <w:rFonts w:asciiTheme="majorBidi" w:eastAsia="Times New Roman" w:hAnsiTheme="majorBidi" w:cstheme="majorBidi"/>
-          <w:color w:val="0A3069"/>
-          <w:sz w:val="24"/>
-          <w:szCs w:val="24"/>
-          <w:lang/>
-        </w:rPr>
-        <w:t>'</w:t>
-      </w:r>
-      <w:r>
-        <w:rPr>
-          <w:rFonts w:asciiTheme="majorBidi" w:eastAsia="Times New Roman" w:hAnsiTheme="majorBidi" w:cstheme="majorBidi"/>
-          <w:color w:val="3F3B35"/>
-          <w:sz w:val="24"/>
-          <w:szCs w:val="24"/>
-          <w:lang/>
+          <w:lang w:val="en-US"/>
+        </w:rPr>
+        <w:t>'Aborted_connects'</w:t>
+      </w:r>
+      <w:r>
+        <w:rPr>
+          <w:rFonts w:asciiTheme="majorBidi" w:eastAsia="Times New Roman" w:hAnsiTheme="majorBidi" w:cstheme="majorBidi"/>
+          <w:color w:val="3F3B35"/>
+          <w:sz w:val="24"/>
+          <w:szCs w:val="24"/>
+          <w:lang w:val="en-US"/>
         </w:rPr>
         <w:t>;</w:t>
       </w:r>
@@ -4566,16 +3795,16 @@
           <w:color w:val="27251E"/>
           <w:sz w:val="24"/>
           <w:szCs w:val="24"/>
-          <w:lang/>
-        </w:rPr>
-      </w:pPr>
-      <w:r>
-        <w:rPr>
-          <w:rFonts w:asciiTheme="majorBidi" w:eastAsia="Times New Roman" w:hAnsiTheme="majorBidi" w:cstheme="majorBidi"/>
-          <w:color w:val="27251E"/>
-          <w:sz w:val="24"/>
-          <w:szCs w:val="24"/>
-          <w:lang/>
+          <w:lang w:val="en-US"/>
+        </w:rPr>
+      </w:pPr>
+      <w:r>
+        <w:rPr>
+          <w:rFonts w:asciiTheme="majorBidi" w:eastAsia="Times New Roman" w:hAnsiTheme="majorBidi" w:cstheme="majorBidi"/>
+          <w:color w:val="27251E"/>
+          <w:sz w:val="24"/>
+          <w:szCs w:val="24"/>
+          <w:lang w:val="en-US"/>
         </w:rPr>
         <w:t>Too many active connections or connection errors can increase response time and reduce database performance.</w:t>
       </w:r>
@@ -4592,18 +3821,16 @@
           <w:color w:val="27251E"/>
           <w:sz w:val="24"/>
           <w:szCs w:val="24"/>
-          <w:lang/>
-        </w:rPr>
-      </w:pPr>
-      <w:r>
-        <w:rPr>
-          <w:rFonts w:asciiTheme="majorBidi" w:eastAsia="Times New Roman" w:hAnsiTheme="majorBidi" w:cstheme="majorBidi"/>
-          <w:b/>
-          <w:bCs/>
-          <w:color w:val="27251E"/>
-          <w:sz w:val="24"/>
-          <w:szCs w:val="24"/>
-          <w:lang/>
+        </w:rPr>
+      </w:pPr>
+      <w:r>
+        <w:rPr>
+          <w:rFonts w:asciiTheme="majorBidi" w:eastAsia="Times New Roman" w:hAnsiTheme="majorBidi" w:cstheme="majorBidi"/>
+          <w:b/>
+          <w:bCs/>
+          <w:color w:val="27251E"/>
+          <w:sz w:val="24"/>
+          <w:szCs w:val="24"/>
         </w:rPr>
         <w:t>8. Practical summary</w:t>
       </w:r>
@@ -4617,42 +3844,19 @@
           <w:color w:val="27251E"/>
           <w:sz w:val="24"/>
           <w:szCs w:val="24"/>
-          <w:lang/>
-        </w:rPr>
-      </w:pPr>
-      <w:r>
-        <w:rPr>
-          <w:rFonts w:asciiTheme="majorBidi" w:eastAsia="Times New Roman" w:hAnsiTheme="majorBidi" w:cstheme="majorBidi"/>
-          <w:color w:val="27251E"/>
-          <w:sz w:val="24"/>
-          <w:szCs w:val="24"/>
-          <w:lang/>
-        </w:rPr>
-        <w:t>Client–server architecture becomes straightforward when you think of it as a request sent by a client and a response returned by a server. Tools such as ping, </w:t>
-      </w:r>
-      <w:proofErr w:type="spellStart"/>
-      <w:r>
-        <w:rPr>
-          <w:rFonts w:asciiTheme="majorBidi" w:eastAsia="Times New Roman" w:hAnsiTheme="majorBidi" w:cstheme="majorBidi"/>
-          <w:color w:val="27251E"/>
-          <w:sz w:val="24"/>
-          <w:szCs w:val="24"/>
-          <w:lang/>
-        </w:rPr>
-        <w:t>traceroute</w:t>
-      </w:r>
-      <w:proofErr w:type="spellEnd"/>
-      <w:r>
-        <w:rPr>
-          <w:rFonts w:asciiTheme="majorBidi" w:eastAsia="Times New Roman" w:hAnsiTheme="majorBidi" w:cstheme="majorBidi"/>
-          <w:color w:val="27251E"/>
-          <w:sz w:val="24"/>
-          <w:szCs w:val="24"/>
-          <w:lang/>
-        </w:rPr>
-        <w:t>, curl -</w:t>
-      </w:r>
-      <w:proofErr w:type="spellStart"/>
+          <w:lang w:val="en-US"/>
+        </w:rPr>
+      </w:pPr>
+      <w:r>
+        <w:rPr>
+          <w:rFonts w:asciiTheme="majorBidi" w:eastAsia="Times New Roman" w:hAnsiTheme="majorBidi" w:cstheme="majorBidi"/>
+          <w:color w:val="27251E"/>
+          <w:sz w:val="24"/>
+          <w:szCs w:val="24"/>
+          <w:lang w:val="en-US"/>
+        </w:rPr>
+        <w:t>Client–server architecture becomes straightforward when you think of it as a request sent by a client and a response returned by a server. Tools such as ping, traceroute, curl -</w:t>
+      </w:r>
       <w:proofErr w:type="gramStart"/>
       <w:r>
         <w:rPr>
@@ -4660,20 +3864,9 @@
           <w:color w:val="27251E"/>
           <w:sz w:val="24"/>
           <w:szCs w:val="24"/>
-          <w:lang/>
-        </w:rPr>
-        <w:t>lv</w:t>
-      </w:r>
-      <w:proofErr w:type="spellEnd"/>
-      <w:r>
-        <w:rPr>
-          <w:rFonts w:asciiTheme="majorBidi" w:eastAsia="Times New Roman" w:hAnsiTheme="majorBidi" w:cstheme="majorBidi"/>
-          <w:color w:val="27251E"/>
-          <w:sz w:val="24"/>
-          <w:szCs w:val="24"/>
-          <w:lang/>
-        </w:rPr>
-        <w:t>,</w:t>
+          <w:lang w:val="en-US"/>
+        </w:rPr>
+        <w:t>lv,</w:t>
       </w:r>
       <w:proofErr w:type="gramEnd"/>
       <w:r>
@@ -4682,31 +3875,9 @@
           <w:color w:val="27251E"/>
           <w:sz w:val="24"/>
           <w:szCs w:val="24"/>
-          <w:lang/>
-        </w:rPr>
-        <w:t xml:space="preserve"> and the </w:t>
-      </w:r>
-      <w:proofErr w:type="spellStart"/>
-      <w:r>
-        <w:rPr>
-          <w:rFonts w:asciiTheme="majorBidi" w:eastAsia="Times New Roman" w:hAnsiTheme="majorBidi" w:cstheme="majorBidi"/>
-          <w:color w:val="27251E"/>
-          <w:sz w:val="24"/>
-          <w:szCs w:val="24"/>
-          <w:lang/>
-        </w:rPr>
-        <w:t>MySQL</w:t>
-      </w:r>
-      <w:proofErr w:type="spellEnd"/>
-      <w:r>
-        <w:rPr>
-          <w:rFonts w:asciiTheme="majorBidi" w:eastAsia="Times New Roman" w:hAnsiTheme="majorBidi" w:cstheme="majorBidi"/>
-          <w:color w:val="27251E"/>
-          <w:sz w:val="24"/>
-          <w:szCs w:val="24"/>
-          <w:lang/>
-        </w:rPr>
-        <w:t xml:space="preserve"> client make that exchange visible and help you diagnose where communication or performance problems occur.</w:t>
+          <w:lang w:val="en-US"/>
+        </w:rPr>
+        <w:t xml:space="preserve"> and the MySQL client make that exchange visible and help you diagnose where communication or performance problems occur.</w:t>
       </w:r>
     </w:p>
     <w:p>
@@ -4717,7 +3888,7 @@
           <w:rFonts w:asciiTheme="majorBidi" w:hAnsiTheme="majorBidi" w:cstheme="majorBidi"/>
           <w:sz w:val="24"/>
           <w:szCs w:val="24"/>
-          <w:lang/>
+          <w:lang w:val="en-US"/>
         </w:rPr>
       </w:pPr>
     </w:p>
@@ -5627,6 +4798,7 @@
   <w:style w:type="paragraph" w:default="1" w:styleId="Normal">
     <w:name w:val="Normal"/>
     <w:qFormat/>
+    <w:rsid w:val="00651A7A"/>
   </w:style>
   <w:style w:type="paragraph" w:styleId="Titre2">
     <w:name w:val="heading 2"/>

</xml_diff>